<commit_message>
Update report edits Word files with final note and remove version clutter
</commit_message>
<xml_diff>
--- a/Accommodation – Medical Documentation/Psychologist/Ken W Letter June 10 2026 PF - KEN EDITS.docx
+++ b/Accommodation – Medical Documentation/Psychologist/Ken W Letter June 10 2026 PF - KEN EDITS.docx
@@ -2194,7 +2194,7 @@
           <w:b w:val="0"/>
           <w:color w:val="1F4E79"/>
         </w:rPr>
-        <w:t>I am the treating physician for Mr. Ken Wood.</w:t>
+        <w:t>I am the treating physician for Mr. Ken Wood, and he is a patient in my care.</w:t>
       </w:r>
     </w:p>
     <w:p>
@@ -2203,7 +2203,7 @@
           <w:b w:val="0"/>
           <w:color w:val="1F4E79"/>
         </w:rPr>
-        <w:t>This note is based on my clinical assessment and ongoing care of this patient.</w:t>
+        <w:t>Mr. Wood has a diagnosed medical condition that constitutes a disability within the meaning of the Ontario Human Rights Code.</w:t>
       </w:r>
     </w:p>
     <w:p>
@@ -2212,7 +2212,7 @@
           <w:b w:val="0"/>
           <w:color w:val="1F4E79"/>
         </w:rPr>
-        <w:t>Mr. Wood has diagnosed medical conditions that constitute a disability within the meaning of the Ontario Human Rights Code.</w:t>
+        <w:t>Mr. Wood's condition is triggered and significantly worsened by commuting to and from the workplace. On days he commutes:</w:t>
       </w:r>
     </w:p>
     <w:p>
@@ -2221,7 +2221,7 @@
           <w:b w:val="0"/>
           <w:color w:val="1F4E79"/>
         </w:rPr>
-        <w:t>Mr. Wood experiences ongoing functional limitations that are triggered and worsened by commuting to and from the workplace:</w:t>
+        <w:t>– He experiences significant anxiety about the commute itself.</w:t>
       </w:r>
     </w:p>
     <w:p>
@@ -2230,7 +2230,7 @@
           <w:b w:val="0"/>
           <w:color w:val="1F4E79"/>
         </w:rPr>
-        <w:t>– Commuting is a trigger that worsens his conditions and increases the risk of relapse.</w:t>
+        <w:t>– He experiences a heightened stress response that persists after arrival and for one to two days afterward.</w:t>
       </w:r>
     </w:p>
     <w:p>
@@ -2239,7 +2239,7 @@
           <w:b w:val="0"/>
           <w:color w:val="1F4E79"/>
         </w:rPr>
-        <w:t>– Driving causes significant anticipatory anxiety and a heightened stress response that persists after arrival and for one to two days afterward.</w:t>
+        <w:t>– His sleep is disrupted on the nights before in-office attendance.</w:t>
       </w:r>
     </w:p>
     <w:p>
@@ -2248,7 +2248,7 @@
           <w:b w:val="0"/>
           <w:color w:val="1F4E79"/>
         </w:rPr>
-        <w:t>– He experiences anticipatory anxiety and avoidance related to driving and the commute.</w:t>
+        <w:t>– He experiences fatigue that reduces his concentration, consistency, and his ability to maintain the routines that support his health.</w:t>
       </w:r>
     </w:p>
     <w:p>
@@ -2257,7 +2257,7 @@
           <w:b w:val="0"/>
           <w:color w:val="1F4E79"/>
         </w:rPr>
-        <w:t>– He has a heightened anxiety and startle response to traffic events that evoke past traumatic incidents.</w:t>
+        <w:t>– These limitations fluctuate; their impact is greater during periods of elevated symptoms.</w:t>
       </w:r>
     </w:p>
     <w:p>
@@ -2266,7 +2266,7 @@
           <w:b w:val="0"/>
           <w:color w:val="1F4E79"/>
         </w:rPr>
-        <w:t>– He experiences intrusive, trauma-related thoughts and hypervigilance while driving.</w:t>
+        <w:t>Continued commuting places Mr. Wood at significant risk of serious deterioration of his condition.</w:t>
       </w:r>
     </w:p>
     <w:p>
@@ -2275,7 +2275,7 @@
           <w:b w:val="0"/>
           <w:color w:val="1F4E79"/>
         </w:rPr>
-        <w:t>– Sleep is disrupted on nights before in-office attendance, reducing his ability to maintain stability.</w:t>
+        <w:t>Accommodation required:</w:t>
       </w:r>
     </w:p>
     <w:p>
@@ -2284,7 +2284,7 @@
           <w:b w:val="0"/>
           <w:color w:val="1F4E79"/>
         </w:rPr>
-        <w:t>– Commuting-related fatigue reduces concentration, consistency, and the ability to maintain the routines that support his health.</w:t>
+        <w:t>Mr. Wood requires a workplace accommodation permitting him to work from home as his functional limitations require, including full-time remote work during periods of elevated symptoms. In-office attendance should be limited to the extent necessary to avoid triggering or worsening these limitations.</w:t>
       </w:r>
     </w:p>
     <w:p>
@@ -2293,34 +2293,7 @@
           <w:b w:val="0"/>
           <w:color w:val="1F4E79"/>
         </w:rPr>
-        <w:t>– These limitations fluctuate; their impact is greater during periods of elevated symptoms.</w:t>
-      </w:r>
-    </w:p>
-    <w:p>
-      <w:r>
-        <w:rPr>
-          <w:b w:val="0"/>
-          <w:color w:val="1F4E79"/>
-        </w:rPr>
-        <w:t>Accommodation required:</w:t>
-      </w:r>
-    </w:p>
-    <w:p>
-      <w:r>
-        <w:rPr>
-          <w:b w:val="0"/>
-          <w:color w:val="1F4E79"/>
-        </w:rPr>
-        <w:t>Mr. Wood requires a workplace accommodation permitting him to work from home as his functional limitations require, including full-time remote work during periods of elevated symptoms. In-office attendance should be limited to the extent necessary to avoid triggering or worsening these limitations.</w:t>
-      </w:r>
-    </w:p>
-    <w:p>
-      <w:r>
-        <w:rPr>
-          <w:b w:val="0"/>
-          <w:color w:val="1F4E79"/>
-        </w:rPr>
-        <w:t>Duration: Ongoing, with reassessment after 12 months.</w:t>
+        <w:t>Duration: Ongoing condition.</w:t>
       </w:r>
     </w:p>
     <w:p>

</xml_diff>

<commit_message>
Commit Word-saved copy of report edits
</commit_message>
<xml_diff>
--- a/Accommodation – Medical Documentation/Psychologist/Ken W Letter June 10 2026 PF - KEN EDITS.docx
+++ b/Accommodation – Medical Documentation/Psychologist/Ken W Letter June 10 2026 PF - KEN EDITS.docx
@@ -205,6 +205,16 @@
         </w:rPr>
         <w:t>D.O.B.:</w:t>
       </w:r>
+      <w:r>
+        <w:rPr>
+          <w:rFonts w:cstheme="minorHAnsi"/>
+          <w:b/>
+          <w:bCs/>
+          <w:sz w:val="22"/>
+          <w:szCs w:val="22"/>
+        </w:rPr>
+        <w:t>1974/12/15</w:t>
+      </w:r>
     </w:p>
     <w:p>
       <w:pPr>
@@ -459,23 +469,13 @@
         </w:rPr>
         <w:t>th</w:t>
       </w:r>
-      <w:proofErr w:type="gramStart"/>
-      <w:r>
-        <w:rPr>
-          <w:rFonts w:cstheme="minorHAnsi"/>
-          <w:sz w:val="22"/>
-          <w:szCs w:val="22"/>
-        </w:rPr>
-        <w:t xml:space="preserve"> 2026</w:t>
-      </w:r>
-      <w:proofErr w:type="gramEnd"/>
-      <w:r>
-        <w:rPr>
-          <w:rFonts w:cstheme="minorHAnsi"/>
-          <w:sz w:val="22"/>
-          <w:szCs w:val="22"/>
-        </w:rPr>
-        <w:t>. In addition, I spoke to his Addiction Counsellor at Addiction Services Central Ontario (Paige McKenzie, RSW) and his wife (Becky Wood) on May 15</w:t>
+      <w:r>
+        <w:rPr>
+          <w:rFonts w:cstheme="minorHAnsi"/>
+          <w:sz w:val="22"/>
+          <w:szCs w:val="22"/>
+        </w:rPr>
+        <w:t xml:space="preserve"> 2026. In addition, I spoke to his Addiction Counsellor at Addiction Services Central Ontario (Paige McKenzie, RSW) and his wife (Becky Wood) on May 15</w:t>
       </w:r>
       <w:r>
         <w:rPr>
@@ -486,23 +486,13 @@
         </w:rPr>
         <w:t>th</w:t>
       </w:r>
-      <w:proofErr w:type="gramStart"/>
-      <w:r>
-        <w:rPr>
-          <w:rFonts w:cstheme="minorHAnsi"/>
-          <w:sz w:val="22"/>
-          <w:szCs w:val="22"/>
-        </w:rPr>
-        <w:t xml:space="preserve"> 2026</w:t>
-      </w:r>
-      <w:proofErr w:type="gramEnd"/>
-      <w:r>
-        <w:rPr>
-          <w:rFonts w:cstheme="minorHAnsi"/>
-          <w:sz w:val="22"/>
-          <w:szCs w:val="22"/>
-        </w:rPr>
-        <w:t>.</w:t>
+      <w:r>
+        <w:rPr>
+          <w:rFonts w:cstheme="minorHAnsi"/>
+          <w:sz w:val="22"/>
+          <w:szCs w:val="22"/>
+        </w:rPr>
+        <w:t xml:space="preserve"> 2026.</w:t>
       </w:r>
     </w:p>
     <w:p>
@@ -638,16 +628,8 @@
           <w:sz w:val="22"/>
           <w:szCs w:val="22"/>
         </w:rPr>
-        <w:t xml:space="preserve">r. Wood reported that he started drinking socially at age 15 or 16and that his drinking increased in his 30s and 40s when he started commuting to work. He reported that he ended up being a heavy daily </w:t>
-      </w:r>
-      <w:r>
-        <w:rPr>
-          <w:rFonts w:cstheme="minorHAnsi"/>
-          <w:sz w:val="22"/>
-          <w:szCs w:val="22"/>
-        </w:rPr>
         <w:lastRenderedPageBreak/>
-        <w:t xml:space="preserve">drinker </w:t>
+        <w:t xml:space="preserve">r. Wood reported that he started drinking socially at age 15 or 16and that his drinking increased in his 30s and 40s when he started commuting to work. He reported that he ended up being a heavy daily drinker </w:t>
       </w:r>
       <w:r>
         <w:rPr>
@@ -671,87 +653,15 @@
           <w:sz w:val="22"/>
           <w:szCs w:val="22"/>
         </w:rPr>
-        <w:t xml:space="preserve">he was told to work from home at the beginning of </w:t>
-      </w:r>
-      <w:proofErr w:type="gramStart"/>
-      <w:r>
-        <w:rPr>
-          <w:rFonts w:cstheme="minorHAnsi"/>
-          <w:sz w:val="22"/>
-          <w:szCs w:val="22"/>
-        </w:rPr>
-        <w:t>COVID</w:t>
-      </w:r>
-      <w:proofErr w:type="gramEnd"/>
-      <w:r>
-        <w:rPr>
-          <w:rFonts w:cstheme="minorHAnsi"/>
-          <w:sz w:val="22"/>
-          <w:szCs w:val="22"/>
-        </w:rPr>
-        <w:t xml:space="preserve"> he realized his drinking was a problem and he quit and he believed that COVID saved his life. He did not seek medical assistance in quitting, or rehab or any 12-step program. He reported that after three weeks he was able to get through the cravings. He reported that he has noticed many positive changes since he stopped drinking.</w:t>
-      </w:r>
-      <w:r>
-        <w:rPr>
-          <w:rFonts w:cstheme="minorHAnsi"/>
-          <w:sz w:val="22"/>
-          <w:szCs w:val="22"/>
-        </w:rPr>
-        <w:t xml:space="preserve"> He reported that prior to COVID he had tried to stop drinking many </w:t>
-      </w:r>
-      <w:proofErr w:type="gramStart"/>
-      <w:r>
-        <w:rPr>
-          <w:rFonts w:cstheme="minorHAnsi"/>
-          <w:sz w:val="22"/>
-          <w:szCs w:val="22"/>
-        </w:rPr>
-        <w:t>times</w:t>
-      </w:r>
-      <w:proofErr w:type="gramEnd"/>
-      <w:r>
-        <w:rPr>
-          <w:rFonts w:cstheme="minorHAnsi"/>
-          <w:sz w:val="22"/>
-          <w:szCs w:val="22"/>
-        </w:rPr>
-        <w:t xml:space="preserve"> but that stopping drinking was </w:t>
-      </w:r>
-      <w:proofErr w:type="gramStart"/>
-      <w:r>
-        <w:rPr>
-          <w:rFonts w:cstheme="minorHAnsi"/>
-          <w:sz w:val="22"/>
-          <w:szCs w:val="22"/>
-        </w:rPr>
-        <w:t>really hard</w:t>
-      </w:r>
-      <w:proofErr w:type="gramEnd"/>
-      <w:r>
-        <w:rPr>
-          <w:rFonts w:cstheme="minorHAnsi"/>
-          <w:sz w:val="22"/>
-          <w:szCs w:val="22"/>
-        </w:rPr>
-        <w:t xml:space="preserve"> and that trying to stop only seemed to make things worse. He reported that in the years when he was drinking </w:t>
-      </w:r>
-      <w:proofErr w:type="gramStart"/>
-      <w:r>
-        <w:rPr>
-          <w:rFonts w:cstheme="minorHAnsi"/>
-          <w:sz w:val="22"/>
-          <w:szCs w:val="22"/>
-        </w:rPr>
-        <w:t>heavily</w:t>
-      </w:r>
-      <w:proofErr w:type="gramEnd"/>
-      <w:r>
-        <w:rPr>
-          <w:rFonts w:cstheme="minorHAnsi"/>
-          <w:sz w:val="22"/>
-          <w:szCs w:val="22"/>
-        </w:rPr>
-        <w:t xml:space="preserve"> he was feeling guilty and sad. He reported that he is terrified of starting drinking again because he is afraid that he won’t be able to stop again.</w:t>
+        <w:t>he was told to work from home at the beginning of COVID he realized his drinking was a problem and he quit and he believed that COVID saved his life. He did not seek medical assistance in quitting, or rehab or any 12-step program. He reported that after three weeks he was able to get through the cravings. He reported that he has noticed many positive changes since he stopped drinking.</w:t>
+      </w:r>
+      <w:r>
+        <w:rPr>
+          <w:rFonts w:cstheme="minorHAnsi"/>
+          <w:sz w:val="22"/>
+          <w:szCs w:val="22"/>
+        </w:rPr>
+        <w:t xml:space="preserve"> He reported that prior to COVID he had tried to stop drinking many times but that stopping drinking was really hard and that trying to stop only seemed to make things worse. He reported that in the years when he was drinking heavily he was feeling guilty and sad. He reported that he is terrified of starting drinking again because he is afraid that he won’t be able to stop again.</w:t>
       </w:r>
     </w:p>
     <w:p>
@@ -803,25 +713,7 @@
           <w:sz w:val="22"/>
           <w:szCs w:val="22"/>
         </w:rPr>
-        <w:t xml:space="preserve">Ms. Smith reported that Mr. Wood is working with her to try to reduce his stress so that he remains abstinent and that commuting is a major stressor in the past that contributed significantly to his heavy daily drinking. She reported that at present he remains abstinent and only gets cravings after driving. She reported that he has been involved in and witnessed </w:t>
-      </w:r>
-      <w:proofErr w:type="gramStart"/>
-      <w:r>
-        <w:rPr>
-          <w:rFonts w:cstheme="minorHAnsi"/>
-          <w:sz w:val="22"/>
-          <w:szCs w:val="22"/>
-        </w:rPr>
-        <w:t>a number of</w:t>
-      </w:r>
-      <w:proofErr w:type="gramEnd"/>
-      <w:r>
-        <w:rPr>
-          <w:rFonts w:cstheme="minorHAnsi"/>
-          <w:sz w:val="22"/>
-          <w:szCs w:val="22"/>
-        </w:rPr>
-        <w:t xml:space="preserve"> motor vehicle accidents while commuting, including one that involved the death of a child.</w:t>
+        <w:t>Ms. Smith reported that Mr. Wood is working with her to try to reduce his stress so that he remains abstinent and that commuting is a major stressor in the past that contributed significantly to his heavy daily drinking. She reported that at present he remains abstinent and only gets cravings after driving. She reported that he has been involved in and witnessed a number of motor vehicle accidents while commuting, including one that involved the death of a child.</w:t>
       </w:r>
     </w:p>
     <w:p>
@@ -871,25 +763,7 @@
           <w:sz w:val="22"/>
           <w:szCs w:val="22"/>
         </w:rPr>
-        <w:t xml:space="preserve">“things got out of control.” She reported that “when COVID </w:t>
-      </w:r>
-      <w:proofErr w:type="gramStart"/>
-      <w:r>
-        <w:rPr>
-          <w:rFonts w:cstheme="minorHAnsi"/>
-          <w:sz w:val="22"/>
-          <w:szCs w:val="22"/>
-        </w:rPr>
-        <w:t>started</w:t>
-      </w:r>
-      <w:proofErr w:type="gramEnd"/>
-      <w:r>
-        <w:rPr>
-          <w:rFonts w:cstheme="minorHAnsi"/>
-          <w:sz w:val="22"/>
-          <w:szCs w:val="22"/>
-        </w:rPr>
-        <w:t xml:space="preserve"> he stopped commuting and he stopped drinking.” She reported that although she does not think that he is currently drinking currently on the days that he commutes to work he is more stressed, short-tempered and irritable.</w:t>
+        <w:t>“things got out of control.” She reported that “when COVID started he stopped commuting and he stopped drinking.” She reported that although she does not think that he is currently drinking currently on the days that he commutes to work he is more stressed, short-tempered and irritable.</w:t>
       </w:r>
     </w:p>
     <w:p>
@@ -1035,61 +909,7 @@
           <w:sz w:val="22"/>
           <w:szCs w:val="22"/>
         </w:rPr>
-        <w:t xml:space="preserve"> He reported that when he doesn’t sleep as </w:t>
-      </w:r>
-      <w:proofErr w:type="gramStart"/>
-      <w:r>
-        <w:rPr>
-          <w:rFonts w:cstheme="minorHAnsi"/>
-          <w:sz w:val="22"/>
-          <w:szCs w:val="22"/>
-        </w:rPr>
-        <w:t>well</w:t>
-      </w:r>
-      <w:proofErr w:type="gramEnd"/>
-      <w:r>
-        <w:rPr>
-          <w:rFonts w:cstheme="minorHAnsi"/>
-          <w:sz w:val="22"/>
-          <w:szCs w:val="22"/>
-        </w:rPr>
-        <w:t xml:space="preserve"> he has a harder time fighting his urges and he is anxious that if he </w:t>
-      </w:r>
-      <w:proofErr w:type="gramStart"/>
-      <w:r>
-        <w:rPr>
-          <w:rFonts w:cstheme="minorHAnsi"/>
-          <w:sz w:val="22"/>
-          <w:szCs w:val="22"/>
-        </w:rPr>
-        <w:t>has to</w:t>
-      </w:r>
-      <w:proofErr w:type="gramEnd"/>
-      <w:r>
-        <w:rPr>
-          <w:rFonts w:cstheme="minorHAnsi"/>
-          <w:sz w:val="22"/>
-          <w:szCs w:val="22"/>
-        </w:rPr>
-        <w:t xml:space="preserve"> commute to the office 5 days a </w:t>
-      </w:r>
-      <w:proofErr w:type="gramStart"/>
-      <w:r>
-        <w:rPr>
-          <w:rFonts w:cstheme="minorHAnsi"/>
-          <w:sz w:val="22"/>
-          <w:szCs w:val="22"/>
-        </w:rPr>
-        <w:t>week</w:t>
-      </w:r>
-      <w:proofErr w:type="gramEnd"/>
-      <w:r>
-        <w:rPr>
-          <w:rFonts w:cstheme="minorHAnsi"/>
-          <w:sz w:val="22"/>
-          <w:szCs w:val="22"/>
-        </w:rPr>
-        <w:t xml:space="preserve"> he will become stressed out and tired and be unable to fight his urges to drink.</w:t>
+        <w:t xml:space="preserve"> He reported that when he doesn’t sleep as well he has a harder time fighting his urges and he is anxious that if he has to commute to the office 5 days a week he will become stressed out and tired and be unable to fight his urges to drink.</w:t>
       </w:r>
     </w:p>
     <w:p>
@@ -1215,7 +1035,6 @@
           <w:szCs w:val="22"/>
           <w:shd w:val="clear" w:color="auto" w:fill="FFFFFF"/>
         </w:rPr>
-        <w:lastRenderedPageBreak/>
         <w:t xml:space="preserve">Mr. Wood reported that he is a very anxious driver and that “driving stresses me out.” He reported a longstanding fear of driving, especially on 400 series highways. He reported that when he gets into the car to go to </w:t>
       </w:r>
       <w:r>
@@ -1229,7 +1048,6 @@
         </w:rPr>
         <w:t xml:space="preserve">or from </w:t>
       </w:r>
-      <w:proofErr w:type="gramStart"/>
       <w:r>
         <w:rPr>
           <w:rStyle w:val="apple-converted-space"/>
@@ -1239,10 +1057,28 @@
           <w:szCs w:val="22"/>
           <w:shd w:val="clear" w:color="auto" w:fill="FFFFFF"/>
         </w:rPr>
-        <w:t>work</w:t>
-      </w:r>
-      <w:proofErr w:type="gramEnd"/>
-      <w:r>
+        <w:t>work he has thoughts such as “Is this the day my life is going to change?”, “Am I going to be paralyzed?”, and “Am I going to die?” He reported that he “takes it (driving) seriously”</w:t>
+      </w:r>
+      <w:r>
+        <w:rPr>
+          <w:rFonts w:cstheme="minorHAnsi"/>
+          <w:sz w:val="22"/>
+          <w:szCs w:val="22"/>
+        </w:rPr>
+        <w:t xml:space="preserve"> and that although he isn’t “white knuckled” when he is driving but he is very focused on driving and that he can feel the stress after he gets out of the car after an hour of driving. He reported that because of his anxiety about driving his baseline stress level is already 7/10 by the time he gets to work in the morning and he is “irritable and grumpy” for a day or two after he commutes. He reported that “stress makes me want to drink and driving stresses me out.” He is concerned that he will return to drinking to cope with stress if he has to commute more than a few days a week.</w:t>
+      </w:r>
+    </w:p>
+    <w:p>
+      <w:pPr>
+        <w:rPr>
+          <w:rFonts w:cstheme="minorHAnsi"/>
+          <w:sz w:val="22"/>
+          <w:szCs w:val="22"/>
+        </w:rPr>
+      </w:pPr>
+    </w:p>
+    <w:p>
+      <w:pPr>
         <w:rPr>
           <w:rStyle w:val="apple-converted-space"/>
           <w:rFonts w:cstheme="minorHAnsi"/>
@@ -1251,64 +1087,56 @@
           <w:szCs w:val="22"/>
           <w:shd w:val="clear" w:color="auto" w:fill="FFFFFF"/>
         </w:rPr>
-        <w:t xml:space="preserve"> he has thoughts such as “Is this the day my life is going to change?”, “Am I going to be paralyzed?”, and “Am I going to die?” He reported that he “takes it (driving) seriously”</w:t>
-      </w:r>
-      <w:r>
-        <w:rPr>
-          <w:rFonts w:cstheme="minorHAnsi"/>
-          <w:sz w:val="22"/>
-          <w:szCs w:val="22"/>
-        </w:rPr>
-        <w:t xml:space="preserve"> and that although he isn’t “white knuckled” when he is driving but he is very focused on driving and that he can feel the stress after he gets out of the car after an hour of driving. He reported that because of his anxiety about driving his baseline stress level is already 7/10 by the time he gets to work in the </w:t>
-      </w:r>
-      <w:proofErr w:type="gramStart"/>
-      <w:r>
-        <w:rPr>
-          <w:rFonts w:cstheme="minorHAnsi"/>
-          <w:sz w:val="22"/>
-          <w:szCs w:val="22"/>
-        </w:rPr>
-        <w:t>morning</w:t>
-      </w:r>
-      <w:proofErr w:type="gramEnd"/>
-      <w:r>
-        <w:rPr>
-          <w:rFonts w:cstheme="minorHAnsi"/>
-          <w:sz w:val="22"/>
-          <w:szCs w:val="22"/>
-        </w:rPr>
-        <w:t xml:space="preserve"> and he is “irritable and grumpy” for a day or two after he commutes. He reported that “stress makes me want to drink and driving stresses me out.” He is concerned that he will return to drinking to cope with stress if he </w:t>
-      </w:r>
-      <w:proofErr w:type="gramStart"/>
-      <w:r>
-        <w:rPr>
-          <w:rFonts w:cstheme="minorHAnsi"/>
-          <w:sz w:val="22"/>
-          <w:szCs w:val="22"/>
-        </w:rPr>
-        <w:t>has to</w:t>
-      </w:r>
-      <w:proofErr w:type="gramEnd"/>
-      <w:r>
-        <w:rPr>
-          <w:rFonts w:cstheme="minorHAnsi"/>
-          <w:sz w:val="22"/>
-          <w:szCs w:val="22"/>
-        </w:rPr>
-        <w:t xml:space="preserve"> commute more than a few days a week.</w:t>
-      </w:r>
-    </w:p>
-    <w:p>
-      <w:pPr>
-        <w:rPr>
-          <w:rFonts w:cstheme="minorHAnsi"/>
-          <w:sz w:val="22"/>
-          <w:szCs w:val="22"/>
-        </w:rPr>
-      </w:pPr>
-    </w:p>
-    <w:p>
-      <w:pPr>
+      </w:pPr>
+      <w:r>
+        <w:rPr>
+          <w:rFonts w:cstheme="minorHAnsi"/>
+          <w:sz w:val="22"/>
+          <w:szCs w:val="22"/>
+        </w:rPr>
+        <w:t>Mr. Wood reported that he has been</w:t>
+      </w:r>
+      <w:r>
+        <w:rPr>
+          <w:rFonts w:cstheme="minorHAnsi"/>
+          <w:sz w:val="22"/>
+          <w:szCs w:val="22"/>
+        </w:rPr>
+        <w:t xml:space="preserve"> involved</w:t>
+      </w:r>
+      <w:r>
+        <w:rPr>
+          <w:rFonts w:cstheme="minorHAnsi"/>
+          <w:sz w:val="22"/>
+          <w:szCs w:val="22"/>
+        </w:rPr>
+        <w:t xml:space="preserve"> in a number of motor vehicle accidents. He reported that he hit a deer once and that he has been rear-ended twice, on one</w:t>
+      </w:r>
+      <w:r>
+        <w:rPr>
+          <w:rFonts w:cstheme="minorHAnsi"/>
+          <w:sz w:val="22"/>
+          <w:szCs w:val="22"/>
+        </w:rPr>
+        <w:t xml:space="preserve"> </w:t>
+      </w:r>
+      <w:r>
+        <w:rPr>
+          <w:rFonts w:cstheme="minorHAnsi"/>
+          <w:sz w:val="22"/>
+          <w:szCs w:val="22"/>
+        </w:rPr>
+        <w:t xml:space="preserve">occasion his car was “totalled.” </w:t>
+      </w:r>
+      <w:r>
+        <w:rPr>
+          <w:rFonts w:cstheme="minorHAnsi"/>
+          <w:sz w:val="22"/>
+          <w:szCs w:val="22"/>
+        </w:rPr>
+        <w:t xml:space="preserve">He reported that once while driving to Toronto he saw a woman and child get hit by a car. He described the experience as traumatic. He reported that he has recurring dreams of accidents, </w:t>
+      </w:r>
+      <w:r>
         <w:rPr>
           <w:rStyle w:val="apple-converted-space"/>
           <w:rFonts w:cstheme="minorHAnsi"/>
@@ -1317,72 +1145,7 @@
           <w:szCs w:val="22"/>
           <w:shd w:val="clear" w:color="auto" w:fill="FFFFFF"/>
         </w:rPr>
-      </w:pPr>
-      <w:r>
-        <w:rPr>
-          <w:rFonts w:cstheme="minorHAnsi"/>
-          <w:sz w:val="22"/>
-          <w:szCs w:val="22"/>
-        </w:rPr>
-        <w:t>Mr. Wood reported that he has been</w:t>
-      </w:r>
-      <w:r>
-        <w:rPr>
-          <w:rFonts w:cstheme="minorHAnsi"/>
-          <w:sz w:val="22"/>
-          <w:szCs w:val="22"/>
-        </w:rPr>
-        <w:t xml:space="preserve"> involved</w:t>
-      </w:r>
-      <w:r>
-        <w:rPr>
-          <w:rFonts w:cstheme="minorHAnsi"/>
-          <w:sz w:val="22"/>
-          <w:szCs w:val="22"/>
-        </w:rPr>
-        <w:t xml:space="preserve"> in </w:t>
-      </w:r>
-      <w:proofErr w:type="gramStart"/>
-      <w:r>
-        <w:rPr>
-          <w:rFonts w:cstheme="minorHAnsi"/>
-          <w:sz w:val="22"/>
-          <w:szCs w:val="22"/>
-        </w:rPr>
-        <w:t>a number of</w:t>
-      </w:r>
-      <w:proofErr w:type="gramEnd"/>
-      <w:r>
-        <w:rPr>
-          <w:rFonts w:cstheme="minorHAnsi"/>
-          <w:sz w:val="22"/>
-          <w:szCs w:val="22"/>
-        </w:rPr>
-        <w:t xml:space="preserve"> motor vehicle accidents. He reported that he hit a deer once and that he has been rear-ended twice, on one</w:t>
-      </w:r>
-      <w:r>
-        <w:rPr>
-          <w:rFonts w:cstheme="minorHAnsi"/>
-          <w:sz w:val="22"/>
-          <w:szCs w:val="22"/>
-        </w:rPr>
-        <w:t xml:space="preserve"> </w:t>
-      </w:r>
-      <w:r>
-        <w:rPr>
-          <w:rFonts w:cstheme="minorHAnsi"/>
-          <w:sz w:val="22"/>
-          <w:szCs w:val="22"/>
-        </w:rPr>
-        <w:t xml:space="preserve">occasion his car was “totalled.” </w:t>
-      </w:r>
-      <w:r>
-        <w:rPr>
-          <w:rFonts w:cstheme="minorHAnsi"/>
-          <w:sz w:val="22"/>
-          <w:szCs w:val="22"/>
-        </w:rPr>
-        <w:t xml:space="preserve">He reported that once while driving to Toronto he saw a woman and child get hit by a car. He described the experience as traumatic. He reported that he has recurring dreams of accidents, </w:t>
+        <w:t>including a recurring nightmare of him slamming onto the back of a truck. He reported that if he thinks about the accident that killed the woman and child he can “hear the mother’s voice.” If his symptoms do not meet formal DSM-V-TR diagnostic criteria for Posttraumatic In my opinion his fear of driving is best understood as having</w:t>
       </w:r>
       <w:r>
         <w:rPr>
@@ -1393,27 +1156,10 @@
           <w:szCs w:val="22"/>
           <w:shd w:val="clear" w:color="auto" w:fill="FFFFFF"/>
         </w:rPr>
-        <w:t>including a recurring nightmare of him slamming onto the back of a truck. He reported that if he thinks about the accident that killed the woman and child he can “hear the mother’s voice.” If his symptoms do not meet formal DSM-V-TR diagnostic criteria for Posttraumatic In my opinion his fear of driving is best understood as having</w:t>
-      </w:r>
-      <w:r>
-        <w:rPr>
-          <w:rStyle w:val="apple-converted-space"/>
-          <w:rFonts w:cstheme="minorHAnsi"/>
-          <w:color w:val="1B1B1B"/>
-          <w:sz w:val="22"/>
-          <w:szCs w:val="22"/>
-          <w:shd w:val="clear" w:color="auto" w:fill="FFFFFF"/>
-        </w:rPr>
         <w:t xml:space="preserve"> a strong traumatic component.</w:t>
       </w:r>
     </w:p>
-    <w:p>
-      <w:r>
-        <w:rPr>
-          <w:b w:val="0"/>
-        </w:rPr>
-      </w:r>
-    </w:p>
+    <w:p/>
     <w:p>
       <w:r>
         <w:rPr>
@@ -1424,45 +1170,64 @@
       </w:r>
     </w:p>
     <w:p>
-      <w:r>
-        <w:rPr>
-          <w:b w:val="0"/>
+      <w:pPr>
+        <w:rPr>
+          <w:color w:val="1F4E79"/>
+        </w:rPr>
+      </w:pPr>
+      <w:r>
+        <w:rPr>
           <w:color w:val="1F4E79"/>
         </w:rPr>
         <w:t>Routines and structure: Commuting disrupts my morning routine (exercise, grounding, a planned start to the day), leaves me unable to decompress after work, and makes it hard to keep up the routines that support my recovery — regular exercise, consistent meals, and grounding.</w:t>
       </w:r>
     </w:p>
-    <w:p>
-      <w:r>
-        <w:rPr>
-          <w:b w:val="0"/>
+    <w:p/>
+    <w:p>
+      <w:pPr>
+        <w:rPr>
+          <w:color w:val="1F4E79"/>
+        </w:rPr>
+      </w:pPr>
+      <w:r>
+        <w:rPr>
           <w:color w:val="1F4E79"/>
         </w:rPr>
         <w:t>Access to treatment and supports: Commuting cuts into my ability to attend counselling and medical appointments and makes me less flexible about engaging in treatment. Working from home keeps me able to do those things.</w:t>
       </w:r>
     </w:p>
-    <w:p>
-      <w:r>
-        <w:rPr>
-          <w:b w:val="0"/>
+    <w:p/>
+    <w:p>
+      <w:pPr>
+        <w:rPr>
+          <w:color w:val="1F4E79"/>
+        </w:rPr>
+      </w:pPr>
+      <w:r>
+        <w:rPr>
           <w:color w:val="1F4E79"/>
         </w:rPr>
         <w:t>Cognitive functioning: After a commute I have trouble sustaining focus, and when I am tired I find planning, organizing, and decision-making harder.</w:t>
       </w:r>
     </w:p>
-    <w:p>
-      <w:r>
-        <w:rPr>
-          <w:b w:val="0"/>
+    <w:p/>
+    <w:p>
+      <w:pPr>
+        <w:rPr>
+          <w:color w:val="1F4E79"/>
+        </w:rPr>
+      </w:pPr>
+      <w:r>
+        <w:rPr>
           <w:color w:val="1F4E79"/>
         </w:rPr>
         <w:t>Triggers and environmental factors: The commute and the return-home routine expose me to triggers tied to my past drinking, and the unpredictability of traffic and weather throws off the routine that keeps me stable.</w:t>
       </w:r>
     </w:p>
-    <w:p>
-      <w:r>
-        <w:rPr>
-          <w:b w:val="0"/>
+    <w:p/>
+    <w:p>
+      <w:r>
+        <w:rPr>
           <w:color w:val="1F4E79"/>
         </w:rPr>
         <w:t>These limitations fluctuate; the impact is worse during periods of elevated symptoms.</w:t>
@@ -1471,7 +1236,6 @@
     <w:p>
       <w:r>
         <w:rPr>
-          <w:b w:val="0"/>
           <w:color w:val="1F4E79"/>
         </w:rPr>
         <w:t>On days I work from home I do not get intrusive thoughts, urges, or the post-commute fatigue. My sleep and functioning are stable. The only thing that changes between those two states is the commute.</w:t>
@@ -1545,6 +1309,7 @@
           <w:sz w:val="22"/>
           <w:szCs w:val="22"/>
         </w:rPr>
+        <w:lastRenderedPageBreak/>
         <w:t>Alcohol Use Disorder in Sustained Remission</w:t>
       </w:r>
     </w:p>
@@ -1812,13 +1577,7 @@
         <w:t xml:space="preserve"> because I think that the risk of him relapsing to alcohol in response to stress is currently very significant and will not diminish for a long time, if ever.</w:t>
       </w:r>
     </w:p>
-    <w:p>
-      <w:r>
-        <w:rPr>
-          <w:b w:val="0"/>
-        </w:rPr>
-      </w:r>
-    </w:p>
+    <w:p/>
     <w:p>
       <w:r>
         <w:rPr>
@@ -1831,7 +1590,6 @@
     <w:p>
       <w:r>
         <w:rPr>
-          <w:b w:val="0"/>
           <w:color w:val="1F4E79"/>
         </w:rPr>
         <w:t>I am asking for remote work, not a fixed limit of two or three days a week in the office. Suggested wording:</w:t>
@@ -1840,7 +1598,6 @@
     <w:p>
       <w:r>
         <w:rPr>
-          <w:b w:val="0"/>
           <w:color w:val="1F4E79"/>
         </w:rPr>
         <w:t>“Ken requires an accommodation that permits him to work from home as his functional limitations require, including full-time remote work during periods of elevated symptoms, with in-office attendance limited to what is necessary to avoid triggering or worsening his limitations.”</w:t>
@@ -2001,34 +1758,10 @@
           <w:sz w:val="22"/>
           <w:szCs w:val="22"/>
         </w:rPr>
-        <w:t xml:space="preserve"> In summary, Mr. Wood may be able to benefit from intensive </w:t>
-      </w:r>
-      <w:proofErr w:type="gramStart"/>
-      <w:r>
-        <w:rPr>
-          <w:rFonts w:cstheme="minorHAnsi"/>
-          <w:sz w:val="22"/>
-          <w:szCs w:val="22"/>
-        </w:rPr>
-        <w:t>treatment</w:t>
-      </w:r>
-      <w:proofErr w:type="gramEnd"/>
-      <w:r>
-        <w:rPr>
-          <w:rFonts w:cstheme="minorHAnsi"/>
-          <w:sz w:val="22"/>
-          <w:szCs w:val="22"/>
-        </w:rPr>
-        <w:t xml:space="preserve"> but I am not sure that Mr. Woods extended health benefits would cover that much treatment.</w:t>
-      </w:r>
-    </w:p>
-    <w:p>
-      <w:r>
-        <w:rPr>
-          <w:b w:val="0"/>
-        </w:rPr>
-      </w:r>
-    </w:p>
+        <w:t xml:space="preserve"> In summary, Mr. Wood may be able to benefit from intensive treatment but I am not sure that Mr. Woods extended health benefits would cover that much treatment.</w:t>
+      </w:r>
+    </w:p>
+    <w:p/>
     <w:p>
       <w:r>
         <w:rPr>
@@ -2041,10 +1774,10 @@
     <w:p>
       <w:r>
         <w:rPr>
-          <w:b w:val="0"/>
-          <w:color w:val="1F4E79"/>
-        </w:rPr>
-        <w:t>I understand the plan is CBT, possibly with medication. It would help if the report noted the review timeline, roughly a year.</w:t>
+          <w:color w:val="1F4E79"/>
+        </w:rPr>
+        <w:lastRenderedPageBreak/>
+        <w:t>I understand the plan is CBT. It would help if the report noted the review timeline, roughly a year.</w:t>
       </w:r>
     </w:p>
     <w:p>
@@ -2136,13 +1869,7 @@
         <w:t>…</w:t>
       </w:r>
     </w:p>
-    <w:p>
-      <w:r>
-        <w:rPr>
-          <w:b w:val="0"/>
-        </w:rPr>
-      </w:r>
-    </w:p>
+    <w:p/>
     <w:p>
       <w:r>
         <w:rPr>
@@ -2155,7 +1882,6 @@
     <w:p>
       <w:r>
         <w:rPr>
-          <w:b w:val="0"/>
           <w:color w:val="1F4E79"/>
         </w:rPr>
         <w:t>[CLINIC LETTERHEAD]</w:t>
@@ -2164,115 +1890,154 @@
     <w:p>
       <w:r>
         <w:rPr>
-          <w:b w:val="0"/>
           <w:color w:val="1F4E79"/>
         </w:rPr>
         <w:t>Date: ____________________</w:t>
       </w:r>
     </w:p>
     <w:p>
-      <w:r>
-        <w:rPr>
-          <w:b w:val="0"/>
+      <w:pPr>
+        <w:rPr>
+          <w:color w:val="1F4E79"/>
+        </w:rPr>
+      </w:pPr>
+    </w:p>
+    <w:p>
+      <w:r>
+        <w:rPr>
           <w:color w:val="1F4E79"/>
         </w:rPr>
         <w:t>To Whom It May Concern (Attention: Human Resources):</w:t>
       </w:r>
     </w:p>
     <w:p>
-      <w:r>
-        <w:rPr>
-          <w:b w:val="0"/>
+      <w:pPr>
+        <w:rPr>
+          <w:color w:val="1F4E79"/>
+        </w:rPr>
+      </w:pPr>
+      <w:r>
+        <w:rPr>
           <w:color w:val="1F4E79"/>
         </w:rPr>
         <w:t>Re: Ken Wood — DOB: ____________________</w:t>
       </w:r>
     </w:p>
-    <w:p>
-      <w:r>
-        <w:rPr>
-          <w:b w:val="0"/>
+    <w:p/>
+    <w:p>
+      <w:pPr>
+        <w:rPr>
+          <w:color w:val="1F4E79"/>
+        </w:rPr>
+      </w:pPr>
+      <w:r>
+        <w:rPr>
           <w:color w:val="1F4E79"/>
         </w:rPr>
         <w:t>I am the treating physician for Mr. Ken Wood, and he is a patient in my care.</w:t>
       </w:r>
     </w:p>
-    <w:p>
-      <w:r>
-        <w:rPr>
-          <w:b w:val="0"/>
-          <w:color w:val="1F4E79"/>
-        </w:rPr>
-        <w:t>Mr. Wood has a diagnosed medical condition that constitutes a disability within the meaning of the Ontario Human Rights Code.</w:t>
-      </w:r>
-    </w:p>
-    <w:p>
-      <w:r>
-        <w:rPr>
-          <w:b w:val="0"/>
+    <w:p/>
+    <w:p>
+      <w:pPr>
+        <w:rPr>
+          <w:color w:val="1F4E79"/>
+        </w:rPr>
+      </w:pPr>
+      <w:r>
+        <w:rPr>
+          <w:color w:val="1F4E79"/>
+        </w:rPr>
+        <w:t>Mr. Wood has a diagnosed medical condition that constitutes a disability within the meaning of the Ontario Human Rights Code</w:t>
+      </w:r>
+      <w:r>
+        <w:rPr>
+          <w:color w:val="1F4E79"/>
+        </w:rPr>
+        <w:t>.</w:t>
+      </w:r>
+    </w:p>
+    <w:p/>
+    <w:p>
+      <w:r>
+        <w:rPr>
           <w:color w:val="1F4E79"/>
         </w:rPr>
         <w:t>Mr. Wood's condition is triggered and significantly worsened by commuting to and from the workplace. On days he commutes:</w:t>
       </w:r>
     </w:p>
     <w:p>
-      <w:r>
-        <w:rPr>
-          <w:b w:val="0"/>
+      <w:pPr>
+        <w:ind w:left="720"/>
+      </w:pPr>
+      <w:r>
+        <w:rPr>
           <w:color w:val="1F4E79"/>
         </w:rPr>
         <w:t>– He experiences significant anxiety about the commute itself.</w:t>
       </w:r>
     </w:p>
     <w:p>
-      <w:r>
-        <w:rPr>
-          <w:b w:val="0"/>
+      <w:pPr>
+        <w:ind w:left="720"/>
+      </w:pPr>
+      <w:r>
+        <w:rPr>
           <w:color w:val="1F4E79"/>
         </w:rPr>
         <w:t>– He experiences a heightened stress response that persists after arrival and for one to two days afterward.</w:t>
       </w:r>
     </w:p>
     <w:p>
-      <w:r>
-        <w:rPr>
-          <w:b w:val="0"/>
+      <w:pPr>
+        <w:ind w:left="720"/>
+      </w:pPr>
+      <w:r>
+        <w:rPr>
           <w:color w:val="1F4E79"/>
         </w:rPr>
         <w:t>– His sleep is disrupted on the nights before in-office attendance.</w:t>
       </w:r>
     </w:p>
     <w:p>
-      <w:r>
-        <w:rPr>
-          <w:b w:val="0"/>
+      <w:pPr>
+        <w:ind w:left="720"/>
+      </w:pPr>
+      <w:r>
+        <w:rPr>
           <w:color w:val="1F4E79"/>
         </w:rPr>
         <w:t>– He experiences fatigue that reduces his concentration, consistency, and his ability to maintain the routines that support his health.</w:t>
       </w:r>
     </w:p>
     <w:p>
-      <w:r>
-        <w:rPr>
-          <w:b w:val="0"/>
+      <w:pPr>
+        <w:ind w:left="720"/>
+      </w:pPr>
+      <w:r>
+        <w:rPr>
           <w:color w:val="1F4E79"/>
         </w:rPr>
         <w:t>– These limitations fluctuate; their impact is greater during periods of elevated symptoms.</w:t>
       </w:r>
     </w:p>
     <w:p>
-      <w:r>
-        <w:rPr>
-          <w:b w:val="0"/>
+      <w:pPr>
+        <w:rPr>
+          <w:color w:val="1F4E79"/>
+        </w:rPr>
+      </w:pPr>
+      <w:r>
+        <w:rPr>
           <w:color w:val="1F4E79"/>
         </w:rPr>
         <w:t>Continued commuting places Mr. Wood at significant risk of serious deterioration of his condition.</w:t>
       </w:r>
     </w:p>
-    <w:p>
-      <w:r>
-        <w:rPr>
-          <w:b w:val="0"/>
+    <w:p/>
+    <w:p>
+      <w:r>
+        <w:rPr>
           <w:color w:val="1F4E79"/>
         </w:rPr>
         <w:t>Accommodation required:</w:t>
@@ -2281,34 +2046,72 @@
     <w:p>
       <w:r>
         <w:rPr>
-          <w:b w:val="0"/>
           <w:color w:val="1F4E79"/>
         </w:rPr>
         <w:t>Mr. Wood requires a workplace accommodation permitting him to work from home as his functional limitations require, including full-time remote work during periods of elevated symptoms. In-office attendance should be limited to the extent necessary to avoid triggering or worsening these limitations.</w:t>
       </w:r>
     </w:p>
     <w:p>
-      <w:r>
-        <w:rPr>
-          <w:b w:val="0"/>
+      <w:pPr>
+        <w:rPr>
+          <w:color w:val="1F4E79"/>
+        </w:rPr>
+      </w:pPr>
+    </w:p>
+    <w:p>
+      <w:r>
+        <w:rPr>
           <w:color w:val="1F4E79"/>
         </w:rPr>
         <w:t>Duration: Ongoing condition.</w:t>
       </w:r>
     </w:p>
     <w:p>
-      <w:r>
-        <w:rPr>
-          <w:b w:val="0"/>
+      <w:pPr>
+        <w:rPr>
+          <w:color w:val="1F4E79"/>
+        </w:rPr>
+      </w:pPr>
+    </w:p>
+    <w:p>
+      <w:pPr>
+        <w:rPr>
+          <w:color w:val="1F4E79"/>
+        </w:rPr>
+      </w:pPr>
+    </w:p>
+    <w:p>
+      <w:pPr>
+        <w:rPr>
+          <w:color w:val="1F4E79"/>
+        </w:rPr>
+      </w:pPr>
+    </w:p>
+    <w:p>
+      <w:r>
+        <w:rPr>
           <w:color w:val="1F4E79"/>
         </w:rPr>
         <w:t>Signed: ______________________________   Date: ______________</w:t>
       </w:r>
     </w:p>
     <w:p>
-      <w:r>
-        <w:rPr>
-          <w:b w:val="0"/>
+      <w:pPr>
+        <w:rPr>
+          <w:color w:val="1F4E79"/>
+        </w:rPr>
+      </w:pPr>
+    </w:p>
+    <w:p>
+      <w:pPr>
+        <w:rPr>
+          <w:color w:val="1F4E79"/>
+        </w:rPr>
+      </w:pPr>
+    </w:p>
+    <w:p>
+      <w:r>
+        <w:rPr>
           <w:color w:val="1F4E79"/>
         </w:rPr>
         <w:t>[Physician name, credentials, CPSO #]</w:t>

</xml_diff>

<commit_message>
Clarify limitation is the commute itself regardless of mode of travel
</commit_message>
<xml_diff>
--- a/Accommodation – Medical Documentation/Psychologist/Ken W Letter June 10 2026 PF - KEN EDITS.docx
+++ b/Accommodation – Medical Documentation/Psychologist/Ken W Letter June 10 2026 PF - KEN EDITS.docx
@@ -205,16 +205,6 @@
         </w:rPr>
         <w:t>D.O.B.:</w:t>
       </w:r>
-      <w:r>
-        <w:rPr>
-          <w:rFonts w:cstheme="minorHAnsi"/>
-          <w:b/>
-          <w:bCs/>
-          <w:sz w:val="22"/>
-          <w:szCs w:val="22"/>
-        </w:rPr>
-        <w:t>1974/12/15</w:t>
-      </w:r>
     </w:p>
     <w:p>
       <w:pPr>
@@ -469,13 +459,23 @@
         </w:rPr>
         <w:t>th</w:t>
       </w:r>
-      <w:r>
-        <w:rPr>
-          <w:rFonts w:cstheme="minorHAnsi"/>
-          <w:sz w:val="22"/>
-          <w:szCs w:val="22"/>
-        </w:rPr>
-        <w:t xml:space="preserve"> 2026. In addition, I spoke to his Addiction Counsellor at Addiction Services Central Ontario (Paige McKenzie, RSW) and his wife (Becky Wood) on May 15</w:t>
+      <w:proofErr w:type="gramStart"/>
+      <w:r>
+        <w:rPr>
+          <w:rFonts w:cstheme="minorHAnsi"/>
+          <w:sz w:val="22"/>
+          <w:szCs w:val="22"/>
+        </w:rPr>
+        <w:t xml:space="preserve"> 2026</w:t>
+      </w:r>
+      <w:proofErr w:type="gramEnd"/>
+      <w:r>
+        <w:rPr>
+          <w:rFonts w:cstheme="minorHAnsi"/>
+          <w:sz w:val="22"/>
+          <w:szCs w:val="22"/>
+        </w:rPr>
+        <w:t>. In addition, I spoke to his Addiction Counsellor at Addiction Services Central Ontario (Paige McKenzie, RSW) and his wife (Becky Wood) on May 15</w:t>
       </w:r>
       <w:r>
         <w:rPr>
@@ -486,13 +486,23 @@
         </w:rPr>
         <w:t>th</w:t>
       </w:r>
-      <w:r>
-        <w:rPr>
-          <w:rFonts w:cstheme="minorHAnsi"/>
-          <w:sz w:val="22"/>
-          <w:szCs w:val="22"/>
-        </w:rPr>
-        <w:t xml:space="preserve"> 2026.</w:t>
+      <w:proofErr w:type="gramStart"/>
+      <w:r>
+        <w:rPr>
+          <w:rFonts w:cstheme="minorHAnsi"/>
+          <w:sz w:val="22"/>
+          <w:szCs w:val="22"/>
+        </w:rPr>
+        <w:t xml:space="preserve"> 2026</w:t>
+      </w:r>
+      <w:proofErr w:type="gramEnd"/>
+      <w:r>
+        <w:rPr>
+          <w:rFonts w:cstheme="minorHAnsi"/>
+          <w:sz w:val="22"/>
+          <w:szCs w:val="22"/>
+        </w:rPr>
+        <w:t>.</w:t>
       </w:r>
     </w:p>
     <w:p>
@@ -628,8 +638,16 @@
           <w:sz w:val="22"/>
           <w:szCs w:val="22"/>
         </w:rPr>
+        <w:t xml:space="preserve">r. Wood reported that he started drinking socially at age 15 or 16and that his drinking increased in his 30s and 40s when he started commuting to work. He reported that he ended up being a heavy daily </w:t>
+      </w:r>
+      <w:r>
+        <w:rPr>
+          <w:rFonts w:cstheme="minorHAnsi"/>
+          <w:sz w:val="22"/>
+          <w:szCs w:val="22"/>
+        </w:rPr>
         <w:lastRenderedPageBreak/>
-        <w:t xml:space="preserve">r. Wood reported that he started drinking socially at age 15 or 16and that his drinking increased in his 30s and 40s when he started commuting to work. He reported that he ended up being a heavy daily drinker </w:t>
+        <w:t xml:space="preserve">drinker </w:t>
       </w:r>
       <w:r>
         <w:rPr>
@@ -653,15 +671,87 @@
           <w:sz w:val="22"/>
           <w:szCs w:val="22"/>
         </w:rPr>
-        <w:t>he was told to work from home at the beginning of COVID he realized his drinking was a problem and he quit and he believed that COVID saved his life. He did not seek medical assistance in quitting, or rehab or any 12-step program. He reported that after three weeks he was able to get through the cravings. He reported that he has noticed many positive changes since he stopped drinking.</w:t>
-      </w:r>
-      <w:r>
-        <w:rPr>
-          <w:rFonts w:cstheme="minorHAnsi"/>
-          <w:sz w:val="22"/>
-          <w:szCs w:val="22"/>
-        </w:rPr>
-        <w:t xml:space="preserve"> He reported that prior to COVID he had tried to stop drinking many times but that stopping drinking was really hard and that trying to stop only seemed to make things worse. He reported that in the years when he was drinking heavily he was feeling guilty and sad. He reported that he is terrified of starting drinking again because he is afraid that he won’t be able to stop again.</w:t>
+        <w:t xml:space="preserve">he was told to work from home at the beginning of </w:t>
+      </w:r>
+      <w:proofErr w:type="gramStart"/>
+      <w:r>
+        <w:rPr>
+          <w:rFonts w:cstheme="minorHAnsi"/>
+          <w:sz w:val="22"/>
+          <w:szCs w:val="22"/>
+        </w:rPr>
+        <w:t>COVID</w:t>
+      </w:r>
+      <w:proofErr w:type="gramEnd"/>
+      <w:r>
+        <w:rPr>
+          <w:rFonts w:cstheme="minorHAnsi"/>
+          <w:sz w:val="22"/>
+          <w:szCs w:val="22"/>
+        </w:rPr>
+        <w:t xml:space="preserve"> he realized his drinking was a problem and he quit and he believed that COVID saved his life. He did not seek medical assistance in quitting, or rehab or any 12-step program. He reported that after three weeks he was able to get through the cravings. He reported that he has noticed many positive changes since he stopped drinking.</w:t>
+      </w:r>
+      <w:r>
+        <w:rPr>
+          <w:rFonts w:cstheme="minorHAnsi"/>
+          <w:sz w:val="22"/>
+          <w:szCs w:val="22"/>
+        </w:rPr>
+        <w:t xml:space="preserve"> He reported that prior to COVID he had tried to stop drinking many </w:t>
+      </w:r>
+      <w:proofErr w:type="gramStart"/>
+      <w:r>
+        <w:rPr>
+          <w:rFonts w:cstheme="minorHAnsi"/>
+          <w:sz w:val="22"/>
+          <w:szCs w:val="22"/>
+        </w:rPr>
+        <w:t>times</w:t>
+      </w:r>
+      <w:proofErr w:type="gramEnd"/>
+      <w:r>
+        <w:rPr>
+          <w:rFonts w:cstheme="minorHAnsi"/>
+          <w:sz w:val="22"/>
+          <w:szCs w:val="22"/>
+        </w:rPr>
+        <w:t xml:space="preserve"> but that stopping drinking was </w:t>
+      </w:r>
+      <w:proofErr w:type="gramStart"/>
+      <w:r>
+        <w:rPr>
+          <w:rFonts w:cstheme="minorHAnsi"/>
+          <w:sz w:val="22"/>
+          <w:szCs w:val="22"/>
+        </w:rPr>
+        <w:t>really hard</w:t>
+      </w:r>
+      <w:proofErr w:type="gramEnd"/>
+      <w:r>
+        <w:rPr>
+          <w:rFonts w:cstheme="minorHAnsi"/>
+          <w:sz w:val="22"/>
+          <w:szCs w:val="22"/>
+        </w:rPr>
+        <w:t xml:space="preserve"> and that trying to stop only seemed to make things worse. He reported that in the years when he was drinking </w:t>
+      </w:r>
+      <w:proofErr w:type="gramStart"/>
+      <w:r>
+        <w:rPr>
+          <w:rFonts w:cstheme="minorHAnsi"/>
+          <w:sz w:val="22"/>
+          <w:szCs w:val="22"/>
+        </w:rPr>
+        <w:t>heavily</w:t>
+      </w:r>
+      <w:proofErr w:type="gramEnd"/>
+      <w:r>
+        <w:rPr>
+          <w:rFonts w:cstheme="minorHAnsi"/>
+          <w:sz w:val="22"/>
+          <w:szCs w:val="22"/>
+        </w:rPr>
+        <w:t xml:space="preserve"> he was feeling guilty and sad. He reported that he is terrified of starting drinking again because he is afraid that he won’t be able to stop again.</w:t>
       </w:r>
     </w:p>
     <w:p>
@@ -713,7 +803,25 @@
           <w:sz w:val="22"/>
           <w:szCs w:val="22"/>
         </w:rPr>
-        <w:t>Ms. Smith reported that Mr. Wood is working with her to try to reduce his stress so that he remains abstinent and that commuting is a major stressor in the past that contributed significantly to his heavy daily drinking. She reported that at present he remains abstinent and only gets cravings after driving. She reported that he has been involved in and witnessed a number of motor vehicle accidents while commuting, including one that involved the death of a child.</w:t>
+        <w:t xml:space="preserve">Ms. Smith reported that Mr. Wood is working with her to try to reduce his stress so that he remains abstinent and that commuting is a major stressor in the past that contributed significantly to his heavy daily drinking. She reported that at present he remains abstinent and only gets cravings after driving. She reported that he has been involved in and witnessed </w:t>
+      </w:r>
+      <w:proofErr w:type="gramStart"/>
+      <w:r>
+        <w:rPr>
+          <w:rFonts w:cstheme="minorHAnsi"/>
+          <w:sz w:val="22"/>
+          <w:szCs w:val="22"/>
+        </w:rPr>
+        <w:t>a number of</w:t>
+      </w:r>
+      <w:proofErr w:type="gramEnd"/>
+      <w:r>
+        <w:rPr>
+          <w:rFonts w:cstheme="minorHAnsi"/>
+          <w:sz w:val="22"/>
+          <w:szCs w:val="22"/>
+        </w:rPr>
+        <w:t xml:space="preserve"> motor vehicle accidents while commuting, including one that involved the death of a child.</w:t>
       </w:r>
     </w:p>
     <w:p>
@@ -763,7 +871,25 @@
           <w:sz w:val="22"/>
           <w:szCs w:val="22"/>
         </w:rPr>
-        <w:t>“things got out of control.” She reported that “when COVID started he stopped commuting and he stopped drinking.” She reported that although she does not think that he is currently drinking currently on the days that he commutes to work he is more stressed, short-tempered and irritable.</w:t>
+        <w:t xml:space="preserve">“things got out of control.” She reported that “when COVID </w:t>
+      </w:r>
+      <w:proofErr w:type="gramStart"/>
+      <w:r>
+        <w:rPr>
+          <w:rFonts w:cstheme="minorHAnsi"/>
+          <w:sz w:val="22"/>
+          <w:szCs w:val="22"/>
+        </w:rPr>
+        <w:t>started</w:t>
+      </w:r>
+      <w:proofErr w:type="gramEnd"/>
+      <w:r>
+        <w:rPr>
+          <w:rFonts w:cstheme="minorHAnsi"/>
+          <w:sz w:val="22"/>
+          <w:szCs w:val="22"/>
+        </w:rPr>
+        <w:t xml:space="preserve"> he stopped commuting and he stopped drinking.” She reported that although she does not think that he is currently drinking currently on the days that he commutes to work he is more stressed, short-tempered and irritable.</w:t>
       </w:r>
     </w:p>
     <w:p>
@@ -909,7 +1035,61 @@
           <w:sz w:val="22"/>
           <w:szCs w:val="22"/>
         </w:rPr>
-        <w:t xml:space="preserve"> He reported that when he doesn’t sleep as well he has a harder time fighting his urges and he is anxious that if he has to commute to the office 5 days a week he will become stressed out and tired and be unable to fight his urges to drink.</w:t>
+        <w:t xml:space="preserve"> He reported that when he doesn’t sleep as </w:t>
+      </w:r>
+      <w:proofErr w:type="gramStart"/>
+      <w:r>
+        <w:rPr>
+          <w:rFonts w:cstheme="minorHAnsi"/>
+          <w:sz w:val="22"/>
+          <w:szCs w:val="22"/>
+        </w:rPr>
+        <w:t>well</w:t>
+      </w:r>
+      <w:proofErr w:type="gramEnd"/>
+      <w:r>
+        <w:rPr>
+          <w:rFonts w:cstheme="minorHAnsi"/>
+          <w:sz w:val="22"/>
+          <w:szCs w:val="22"/>
+        </w:rPr>
+        <w:t xml:space="preserve"> he has a harder time fighting his urges and he is anxious that if he </w:t>
+      </w:r>
+      <w:proofErr w:type="gramStart"/>
+      <w:r>
+        <w:rPr>
+          <w:rFonts w:cstheme="minorHAnsi"/>
+          <w:sz w:val="22"/>
+          <w:szCs w:val="22"/>
+        </w:rPr>
+        <w:t>has to</w:t>
+      </w:r>
+      <w:proofErr w:type="gramEnd"/>
+      <w:r>
+        <w:rPr>
+          <w:rFonts w:cstheme="minorHAnsi"/>
+          <w:sz w:val="22"/>
+          <w:szCs w:val="22"/>
+        </w:rPr>
+        <w:t xml:space="preserve"> commute to the office 5 days a </w:t>
+      </w:r>
+      <w:proofErr w:type="gramStart"/>
+      <w:r>
+        <w:rPr>
+          <w:rFonts w:cstheme="minorHAnsi"/>
+          <w:sz w:val="22"/>
+          <w:szCs w:val="22"/>
+        </w:rPr>
+        <w:t>week</w:t>
+      </w:r>
+      <w:proofErr w:type="gramEnd"/>
+      <w:r>
+        <w:rPr>
+          <w:rFonts w:cstheme="minorHAnsi"/>
+          <w:sz w:val="22"/>
+          <w:szCs w:val="22"/>
+        </w:rPr>
+        <w:t xml:space="preserve"> he will become stressed out and tired and be unable to fight his urges to drink.</w:t>
       </w:r>
     </w:p>
     <w:p>
@@ -1035,6 +1215,7 @@
           <w:szCs w:val="22"/>
           <w:shd w:val="clear" w:color="auto" w:fill="FFFFFF"/>
         </w:rPr>
+        <w:lastRenderedPageBreak/>
         <w:t xml:space="preserve">Mr. Wood reported that he is a very anxious driver and that “driving stresses me out.” He reported a longstanding fear of driving, especially on 400 series highways. He reported that when he gets into the car to go to </w:t>
       </w:r>
       <w:r>
@@ -1048,6 +1229,7 @@
         </w:rPr>
         <w:t xml:space="preserve">or from </w:t>
       </w:r>
+      <w:proofErr w:type="gramStart"/>
       <w:r>
         <w:rPr>
           <w:rStyle w:val="apple-converted-space"/>
@@ -1057,28 +1239,10 @@
           <w:szCs w:val="22"/>
           <w:shd w:val="clear" w:color="auto" w:fill="FFFFFF"/>
         </w:rPr>
-        <w:t>work he has thoughts such as “Is this the day my life is going to change?”, “Am I going to be paralyzed?”, and “Am I going to die?” He reported that he “takes it (driving) seriously”</w:t>
-      </w:r>
-      <w:r>
-        <w:rPr>
-          <w:rFonts w:cstheme="minorHAnsi"/>
-          <w:sz w:val="22"/>
-          <w:szCs w:val="22"/>
-        </w:rPr>
-        <w:t xml:space="preserve"> and that although he isn’t “white knuckled” when he is driving but he is very focused on driving and that he can feel the stress after he gets out of the car after an hour of driving. He reported that because of his anxiety about driving his baseline stress level is already 7/10 by the time he gets to work in the morning and he is “irritable and grumpy” for a day or two after he commutes. He reported that “stress makes me want to drink and driving stresses me out.” He is concerned that he will return to drinking to cope with stress if he has to commute more than a few days a week.</w:t>
-      </w:r>
-    </w:p>
-    <w:p>
-      <w:pPr>
-        <w:rPr>
-          <w:rFonts w:cstheme="minorHAnsi"/>
-          <w:sz w:val="22"/>
-          <w:szCs w:val="22"/>
-        </w:rPr>
-      </w:pPr>
-    </w:p>
-    <w:p>
-      <w:pPr>
+        <w:t>work</w:t>
+      </w:r>
+      <w:proofErr w:type="gramEnd"/>
+      <w:r>
         <w:rPr>
           <w:rStyle w:val="apple-converted-space"/>
           <w:rFonts w:cstheme="minorHAnsi"/>
@@ -1087,6 +1251,72 @@
           <w:szCs w:val="22"/>
           <w:shd w:val="clear" w:color="auto" w:fill="FFFFFF"/>
         </w:rPr>
+        <w:t xml:space="preserve"> he has thoughts such as “Is this the day my life is going to change?”, “Am I going to be paralyzed?”, and “Am I going to die?” He reported that he “takes it (driving) seriously”</w:t>
+      </w:r>
+      <w:r>
+        <w:rPr>
+          <w:rFonts w:cstheme="minorHAnsi"/>
+          <w:sz w:val="22"/>
+          <w:szCs w:val="22"/>
+        </w:rPr>
+        <w:t xml:space="preserve"> and that although he isn’t “white knuckled” when he is driving but he is very focused on driving and that he can feel the stress after he gets out of the car after an hour of driving. He reported that because of his anxiety about driving his baseline stress level is already 7/10 by the time he gets to work in the </w:t>
+      </w:r>
+      <w:proofErr w:type="gramStart"/>
+      <w:r>
+        <w:rPr>
+          <w:rFonts w:cstheme="minorHAnsi"/>
+          <w:sz w:val="22"/>
+          <w:szCs w:val="22"/>
+        </w:rPr>
+        <w:t>morning</w:t>
+      </w:r>
+      <w:proofErr w:type="gramEnd"/>
+      <w:r>
+        <w:rPr>
+          <w:rFonts w:cstheme="minorHAnsi"/>
+          <w:sz w:val="22"/>
+          <w:szCs w:val="22"/>
+        </w:rPr>
+        <w:t xml:space="preserve"> and he is “irritable and grumpy” for a day or two after he commutes. He reported that “stress makes me want to drink and driving stresses me out.” He is concerned that he will return to drinking to cope with stress if he </w:t>
+      </w:r>
+      <w:proofErr w:type="gramStart"/>
+      <w:r>
+        <w:rPr>
+          <w:rFonts w:cstheme="minorHAnsi"/>
+          <w:sz w:val="22"/>
+          <w:szCs w:val="22"/>
+        </w:rPr>
+        <w:t>has to</w:t>
+      </w:r>
+      <w:proofErr w:type="gramEnd"/>
+      <w:r>
+        <w:rPr>
+          <w:rFonts w:cstheme="minorHAnsi"/>
+          <w:sz w:val="22"/>
+          <w:szCs w:val="22"/>
+        </w:rPr>
+        <w:t xml:space="preserve"> commute more than a few days a week.</w:t>
+      </w:r>
+    </w:p>
+    <w:p>
+      <w:pPr>
+        <w:rPr>
+          <w:rFonts w:cstheme="minorHAnsi"/>
+          <w:sz w:val="22"/>
+          <w:szCs w:val="22"/>
+        </w:rPr>
+      </w:pPr>
+    </w:p>
+    <w:p>
+      <w:pPr>
+        <w:rPr>
+          <w:rStyle w:val="apple-converted-space"/>
+          <w:rFonts w:cstheme="minorHAnsi"/>
+          <w:color w:val="1B1B1B"/>
+          <w:sz w:val="22"/>
+          <w:szCs w:val="22"/>
+          <w:shd w:val="clear" w:color="auto" w:fill="FFFFFF"/>
+        </w:rPr>
       </w:pPr>
       <w:r>
         <w:rPr>
@@ -1110,7 +1340,25 @@
           <w:sz w:val="22"/>
           <w:szCs w:val="22"/>
         </w:rPr>
-        <w:t xml:space="preserve"> in a number of motor vehicle accidents. He reported that he hit a deer once and that he has been rear-ended twice, on one</w:t>
+        <w:t xml:space="preserve"> in </w:t>
+      </w:r>
+      <w:proofErr w:type="gramStart"/>
+      <w:r>
+        <w:rPr>
+          <w:rFonts w:cstheme="minorHAnsi"/>
+          <w:sz w:val="22"/>
+          <w:szCs w:val="22"/>
+        </w:rPr>
+        <w:t>a number of</w:t>
+      </w:r>
+      <w:proofErr w:type="gramEnd"/>
+      <w:r>
+        <w:rPr>
+          <w:rFonts w:cstheme="minorHAnsi"/>
+          <w:sz w:val="22"/>
+          <w:szCs w:val="22"/>
+        </w:rPr>
+        <w:t xml:space="preserve"> motor vehicle accidents. He reported that he hit a deer once and that he has been rear-ended twice, on one</w:t>
       </w:r>
       <w:r>
         <w:rPr>
@@ -1159,7 +1407,13 @@
         <w:t xml:space="preserve"> a strong traumatic component.</w:t>
       </w:r>
     </w:p>
-    <w:p/>
+    <w:p>
+      <w:r>
+        <w:rPr>
+          <w:b w:val="0"/>
+        </w:rPr>
+      </w:r>
+    </w:p>
     <w:p>
       <w:r>
         <w:rPr>
@@ -1170,72 +1424,54 @@
       </w:r>
     </w:p>
     <w:p>
-      <w:pPr>
-        <w:rPr>
+      <w:r>
+        <w:rPr>
+          <w:b w:val="0"/>
           <w:color w:val="1F4E79"/>
         </w:rPr>
-      </w:pPr>
-      <w:r>
-        <w:rPr>
+        <w:t>Routines and structure: Commuting disrupts my morning routine (exercise, grounding, a planned start to the day), leaves me unable to decompress after work, and makes it hard to keep up the routines that support my recovery — regular exercise, consistent meals, and grounding.</w:t>
+      </w:r>
+    </w:p>
+    <w:p>
+      <w:r>
+        <w:rPr>
+          <w:b w:val="0"/>
           <w:color w:val="1F4E79"/>
         </w:rPr>
-        <w:t>Routines and structure: Commuting disrupts my morning routine (exercise, grounding, a planned start to the day), leaves me unable to decompress after work, and makes it hard to keep up the routines that support my recovery — regular exercise, consistent meals, and grounding.</w:t>
-      </w:r>
-    </w:p>
-    <w:p/>
-    <w:p>
-      <w:pPr>
-        <w:rPr>
+        <w:t>Access to treatment and supports: Commuting cuts into my ability to attend counselling and medical appointments and makes me less flexible about engaging in treatment. Working from home keeps me able to do those things.</w:t>
+      </w:r>
+    </w:p>
+    <w:p>
+      <w:r>
+        <w:rPr>
+          <w:b w:val="0"/>
           <w:color w:val="1F4E79"/>
         </w:rPr>
-      </w:pPr>
-      <w:r>
-        <w:rPr>
+        <w:t>Cognitive functioning: After a commute I have trouble sustaining focus, and when I am tired I find planning, organizing, and decision-making harder.</w:t>
+      </w:r>
+    </w:p>
+    <w:p>
+      <w:r>
+        <w:rPr>
+          <w:b w:val="0"/>
           <w:color w:val="1F4E79"/>
         </w:rPr>
-        <w:t>Access to treatment and supports: Commuting cuts into my ability to attend counselling and medical appointments and makes me less flexible about engaging in treatment. Working from home keeps me able to do those things.</w:t>
-      </w:r>
-    </w:p>
-    <w:p/>
-    <w:p>
-      <w:pPr>
-        <w:rPr>
+        <w:t>Triggers and environmental factors: The commute and the return-home routine expose me to triggers tied to my past drinking, and the unpredictability of traffic and weather throws off the routine that keeps me stable.</w:t>
+      </w:r>
+    </w:p>
+    <w:p>
+      <w:r>
+        <w:rPr>
+          <w:b w:val="0"/>
           <w:color w:val="1F4E79"/>
         </w:rPr>
-      </w:pPr>
-      <w:r>
-        <w:rPr>
-          <w:color w:val="1F4E79"/>
-        </w:rPr>
-        <w:t>Cognitive functioning: After a commute I have trouble sustaining focus, and when I am tired I find planning, organizing, and decision-making harder.</w:t>
-      </w:r>
-    </w:p>
-    <w:p/>
-    <w:p>
-      <w:pPr>
-        <w:rPr>
-          <w:color w:val="1F4E79"/>
-        </w:rPr>
-      </w:pPr>
-      <w:r>
-        <w:rPr>
-          <w:color w:val="1F4E79"/>
-        </w:rPr>
-        <w:t>Triggers and environmental factors: The commute and the return-home routine expose me to triggers tied to my past drinking, and the unpredictability of traffic and weather throws off the routine that keeps me stable.</w:t>
-      </w:r>
-    </w:p>
-    <w:p/>
-    <w:p>
-      <w:r>
-        <w:rPr>
-          <w:color w:val="1F4E79"/>
-        </w:rPr>
         <w:t>These limitations fluctuate; the impact is worse during periods of elevated symptoms.</w:t>
       </w:r>
     </w:p>
     <w:p>
       <w:r>
         <w:rPr>
+          <w:b w:val="0"/>
           <w:color w:val="1F4E79"/>
         </w:rPr>
         <w:t>On days I work from home I do not get intrusive thoughts, urges, or the post-commute fatigue. My sleep and functioning are stable. The only thing that changes between those two states is the commute.</w:t>
@@ -1309,7 +1545,6 @@
           <w:sz w:val="22"/>
           <w:szCs w:val="22"/>
         </w:rPr>
-        <w:lastRenderedPageBreak/>
         <w:t>Alcohol Use Disorder in Sustained Remission</w:t>
       </w:r>
     </w:p>
@@ -1577,7 +1812,13 @@
         <w:t xml:space="preserve"> because I think that the risk of him relapsing to alcohol in response to stress is currently very significant and will not diminish for a long time, if ever.</w:t>
       </w:r>
     </w:p>
-    <w:p/>
+    <w:p>
+      <w:r>
+        <w:rPr>
+          <w:b w:val="0"/>
+        </w:rPr>
+      </w:r>
+    </w:p>
     <w:p>
       <w:r>
         <w:rPr>
@@ -1590,6 +1831,7 @@
     <w:p>
       <w:r>
         <w:rPr>
+          <w:b w:val="0"/>
           <w:color w:val="1F4E79"/>
         </w:rPr>
         <w:t>I am asking for remote work, not a fixed limit of two or three days a week in the office. Suggested wording:</w:t>
@@ -1598,6 +1840,7 @@
     <w:p>
       <w:r>
         <w:rPr>
+          <w:b w:val="0"/>
           <w:color w:val="1F4E79"/>
         </w:rPr>
         <w:t>“Ken requires an accommodation that permits him to work from home as his functional limitations require, including full-time remote work during periods of elevated symptoms, with in-office attendance limited to what is necessary to avoid triggering or worsening his limitations.”</w:t>
@@ -1758,10 +2001,34 @@
           <w:sz w:val="22"/>
           <w:szCs w:val="22"/>
         </w:rPr>
-        <w:t xml:space="preserve"> In summary, Mr. Wood may be able to benefit from intensive treatment but I am not sure that Mr. Woods extended health benefits would cover that much treatment.</w:t>
-      </w:r>
-    </w:p>
-    <w:p/>
+        <w:t xml:space="preserve"> In summary, Mr. Wood may be able to benefit from intensive </w:t>
+      </w:r>
+      <w:proofErr w:type="gramStart"/>
+      <w:r>
+        <w:rPr>
+          <w:rFonts w:cstheme="minorHAnsi"/>
+          <w:sz w:val="22"/>
+          <w:szCs w:val="22"/>
+        </w:rPr>
+        <w:t>treatment</w:t>
+      </w:r>
+      <w:proofErr w:type="gramEnd"/>
+      <w:r>
+        <w:rPr>
+          <w:rFonts w:cstheme="minorHAnsi"/>
+          <w:sz w:val="22"/>
+          <w:szCs w:val="22"/>
+        </w:rPr>
+        <w:t xml:space="preserve"> but I am not sure that Mr. Woods extended health benefits would cover that much treatment.</w:t>
+      </w:r>
+    </w:p>
+    <w:p>
+      <w:r>
+        <w:rPr>
+          <w:b w:val="0"/>
+        </w:rPr>
+      </w:r>
+    </w:p>
     <w:p>
       <w:r>
         <w:rPr>
@@ -1774,10 +2041,10 @@
     <w:p>
       <w:r>
         <w:rPr>
+          <w:b w:val="0"/>
           <w:color w:val="1F4E79"/>
         </w:rPr>
-        <w:lastRenderedPageBreak/>
-        <w:t>I understand the plan is CBT. It would help if the report noted the review timeline, roughly a year.</w:t>
+        <w:t>I understand the plan is CBT, possibly with medication. It would help if the report noted the review timeline, roughly a year.</w:t>
       </w:r>
     </w:p>
     <w:p>
@@ -1869,7 +2136,13 @@
         <w:t>…</w:t>
       </w:r>
     </w:p>
-    <w:p/>
+    <w:p>
+      <w:r>
+        <w:rPr>
+          <w:b w:val="0"/>
+        </w:rPr>
+      </w:r>
+    </w:p>
     <w:p>
       <w:r>
         <w:rPr>
@@ -1882,6 +2155,7 @@
     <w:p>
       <w:r>
         <w:rPr>
+          <w:b w:val="0"/>
           <w:color w:val="1F4E79"/>
         </w:rPr>
         <w:t>[CLINIC LETTERHEAD]</w:t>
@@ -1890,228 +2164,151 @@
     <w:p>
       <w:r>
         <w:rPr>
+          <w:b w:val="0"/>
           <w:color w:val="1F4E79"/>
         </w:rPr>
         <w:t>Date: ____________________</w:t>
       </w:r>
     </w:p>
     <w:p>
-      <w:pPr>
-        <w:rPr>
+      <w:r>
+        <w:rPr>
+          <w:b w:val="0"/>
           <w:color w:val="1F4E79"/>
         </w:rPr>
-      </w:pPr>
-    </w:p>
-    <w:p>
-      <w:r>
-        <w:rPr>
+        <w:t>To Whom It May Concern (Attention: Human Resources):</w:t>
+      </w:r>
+    </w:p>
+    <w:p>
+      <w:r>
+        <w:rPr>
+          <w:b w:val="0"/>
           <w:color w:val="1F4E79"/>
         </w:rPr>
-        <w:t>To Whom It May Concern (Attention: Human Resources):</w:t>
-      </w:r>
-    </w:p>
-    <w:p>
-      <w:pPr>
-        <w:rPr>
+        <w:t>Re: Ken Wood — DOB: ____________________</w:t>
+      </w:r>
+    </w:p>
+    <w:p>
+      <w:r>
+        <w:rPr>
+          <w:b w:val="0"/>
           <w:color w:val="1F4E79"/>
         </w:rPr>
-      </w:pPr>
-      <w:r>
-        <w:rPr>
+        <w:t>I am the treating physician for Mr. Ken Wood, and he is a patient in my care.</w:t>
+      </w:r>
+    </w:p>
+    <w:p>
+      <w:r>
+        <w:rPr>
+          <w:b w:val="0"/>
           <w:color w:val="1F4E79"/>
         </w:rPr>
-        <w:t>Re: Ken Wood — DOB: ____________________</w:t>
-      </w:r>
-    </w:p>
-    <w:p/>
-    <w:p>
-      <w:pPr>
-        <w:rPr>
+        <w:t>Mr. Wood has a diagnosed medical condition that constitutes a disability within the meaning of the Ontario Human Rights Code.</w:t>
+      </w:r>
+    </w:p>
+    <w:p>
+      <w:r>
+        <w:rPr>
+          <w:b w:val="0"/>
           <w:color w:val="1F4E79"/>
         </w:rPr>
-      </w:pPr>
-      <w:r>
-        <w:rPr>
+        <w:t>Mr. Wood's condition is triggered and significantly worsened by commuting to and from the workplace, regardless of the mode of travel. On days he commutes:</w:t>
+      </w:r>
+    </w:p>
+    <w:p>
+      <w:r>
+        <w:rPr>
+          <w:b w:val="0"/>
           <w:color w:val="1F4E79"/>
         </w:rPr>
-        <w:t>I am the treating physician for Mr. Ken Wood, and he is a patient in my care.</w:t>
-      </w:r>
-    </w:p>
-    <w:p/>
-    <w:p>
-      <w:pPr>
-        <w:rPr>
+        <w:t>– He experiences significant anxiety about the commute itself.</w:t>
+      </w:r>
+    </w:p>
+    <w:p>
+      <w:r>
+        <w:rPr>
+          <w:b w:val="0"/>
           <w:color w:val="1F4E79"/>
         </w:rPr>
-      </w:pPr>
-      <w:r>
-        <w:rPr>
+        <w:t>– He experiences a heightened stress response that persists after arrival and for one to two days afterward.</w:t>
+      </w:r>
+    </w:p>
+    <w:p>
+      <w:r>
+        <w:rPr>
+          <w:b w:val="0"/>
           <w:color w:val="1F4E79"/>
         </w:rPr>
-        <w:t>Mr. Wood has a diagnosed medical condition that constitutes a disability within the meaning of the Ontario Human Rights Code</w:t>
-      </w:r>
-      <w:r>
-        <w:rPr>
+        <w:t>– His sleep is disrupted on the nights before in-office attendance.</w:t>
+      </w:r>
+    </w:p>
+    <w:p>
+      <w:r>
+        <w:rPr>
+          <w:b w:val="0"/>
           <w:color w:val="1F4E79"/>
         </w:rPr>
-        <w:t>.</w:t>
-      </w:r>
-    </w:p>
-    <w:p/>
-    <w:p>
-      <w:r>
-        <w:rPr>
+        <w:t>– He experiences fatigue that reduces his concentration, consistency, and his ability to maintain the routines that support his health.</w:t>
+      </w:r>
+    </w:p>
+    <w:p>
+      <w:r>
+        <w:rPr>
+          <w:b w:val="0"/>
           <w:color w:val="1F4E79"/>
         </w:rPr>
-        <w:t>Mr. Wood's condition is triggered and significantly worsened by commuting to and from the workplace. On days he commutes:</w:t>
-      </w:r>
-    </w:p>
-    <w:p>
-      <w:pPr>
-        <w:ind w:left="720"/>
-      </w:pPr>
-      <w:r>
-        <w:rPr>
+        <w:t>– These limitations fluctuate; their impact is greater during periods of elevated symptoms.</w:t>
+      </w:r>
+    </w:p>
+    <w:p>
+      <w:r>
+        <w:rPr>
+          <w:b w:val="0"/>
           <w:color w:val="1F4E79"/>
         </w:rPr>
-        <w:t>– He experiences significant anxiety about the commute itself.</w:t>
-      </w:r>
-    </w:p>
-    <w:p>
-      <w:pPr>
-        <w:ind w:left="720"/>
-      </w:pPr>
-      <w:r>
-        <w:rPr>
+        <w:t>Continued commuting places Mr. Wood at significant risk of serious deterioration of his condition.</w:t>
+      </w:r>
+    </w:p>
+    <w:p>
+      <w:r>
+        <w:rPr>
+          <w:b w:val="0"/>
           <w:color w:val="1F4E79"/>
         </w:rPr>
-        <w:t>– He experiences a heightened stress response that persists after arrival and for one to two days afterward.</w:t>
-      </w:r>
-    </w:p>
-    <w:p>
-      <w:pPr>
-        <w:ind w:left="720"/>
-      </w:pPr>
-      <w:r>
-        <w:rPr>
+        <w:t>Accommodation required:</w:t>
+      </w:r>
+    </w:p>
+    <w:p>
+      <w:r>
+        <w:rPr>
+          <w:b w:val="0"/>
           <w:color w:val="1F4E79"/>
         </w:rPr>
-        <w:t>– His sleep is disrupted on the nights before in-office attendance.</w:t>
-      </w:r>
-    </w:p>
-    <w:p>
-      <w:pPr>
-        <w:ind w:left="720"/>
-      </w:pPr>
-      <w:r>
-        <w:rPr>
+        <w:t>Mr. Wood requires a workplace accommodation permitting him to work from home as his functional limitations require, including full-time remote work during periods of elevated symptoms. In-office attendance should be limited to the extent necessary to avoid triggering or worsening these limitations. Alternative commuting arrangements (such as transit or carpooling) would not address these limitations, as the trigger is the commute itself rather than the mode of travel.</w:t>
+      </w:r>
+    </w:p>
+    <w:p>
+      <w:r>
+        <w:rPr>
+          <w:b w:val="0"/>
           <w:color w:val="1F4E79"/>
         </w:rPr>
-        <w:t>– He experiences fatigue that reduces his concentration, consistency, and his ability to maintain the routines that support his health.</w:t>
-      </w:r>
-    </w:p>
-    <w:p>
-      <w:pPr>
-        <w:ind w:left="720"/>
-      </w:pPr>
-      <w:r>
-        <w:rPr>
+        <w:t>Duration: Ongoing condition.</w:t>
+      </w:r>
+    </w:p>
+    <w:p>
+      <w:r>
+        <w:rPr>
+          <w:b w:val="0"/>
           <w:color w:val="1F4E79"/>
         </w:rPr>
-        <w:t>– These limitations fluctuate; their impact is greater during periods of elevated symptoms.</w:t>
-      </w:r>
-    </w:p>
-    <w:p>
-      <w:pPr>
-        <w:rPr>
-          <w:color w:val="1F4E79"/>
-        </w:rPr>
-      </w:pPr>
-      <w:r>
-        <w:rPr>
-          <w:color w:val="1F4E79"/>
-        </w:rPr>
-        <w:t>Continued commuting places Mr. Wood at significant risk of serious deterioration of his condition.</w:t>
-      </w:r>
-    </w:p>
-    <w:p/>
-    <w:p>
-      <w:r>
-        <w:rPr>
-          <w:color w:val="1F4E79"/>
-        </w:rPr>
-        <w:t>Accommodation required:</w:t>
-      </w:r>
-    </w:p>
-    <w:p>
-      <w:r>
-        <w:rPr>
-          <w:color w:val="1F4E79"/>
-        </w:rPr>
-        <w:t>Mr. Wood requires a workplace accommodation permitting him to work from home as his functional limitations require, including full-time remote work during periods of elevated symptoms. In-office attendance should be limited to the extent necessary to avoid triggering or worsening these limitations.</w:t>
-      </w:r>
-    </w:p>
-    <w:p>
-      <w:pPr>
-        <w:rPr>
-          <w:color w:val="1F4E79"/>
-        </w:rPr>
-      </w:pPr>
-    </w:p>
-    <w:p>
-      <w:r>
-        <w:rPr>
-          <w:color w:val="1F4E79"/>
-        </w:rPr>
-        <w:t>Duration: Ongoing condition.</w:t>
-      </w:r>
-    </w:p>
-    <w:p>
-      <w:pPr>
-        <w:rPr>
-          <w:color w:val="1F4E79"/>
-        </w:rPr>
-      </w:pPr>
-    </w:p>
-    <w:p>
-      <w:pPr>
-        <w:rPr>
-          <w:color w:val="1F4E79"/>
-        </w:rPr>
-      </w:pPr>
-    </w:p>
-    <w:p>
-      <w:pPr>
-        <w:rPr>
-          <w:color w:val="1F4E79"/>
-        </w:rPr>
-      </w:pPr>
-    </w:p>
-    <w:p>
-      <w:r>
-        <w:rPr>
-          <w:color w:val="1F4E79"/>
-        </w:rPr>
         <w:t>Signed: ______________________________   Date: ______________</w:t>
       </w:r>
     </w:p>
     <w:p>
-      <w:pPr>
-        <w:rPr>
-          <w:color w:val="1F4E79"/>
-        </w:rPr>
-      </w:pPr>
-    </w:p>
-    <w:p>
-      <w:pPr>
-        <w:rPr>
-          <w:color w:val="1F4E79"/>
-        </w:rPr>
-      </w:pPr>
-    </w:p>
-    <w:p>
-      <w:r>
-        <w:rPr>
+      <w:r>
+        <w:rPr>
+          <w:b w:val="0"/>
           <w:color w:val="1F4E79"/>
         </w:rPr>
         <w:t>[Physician name, credentials, CPSO #]</w:t>

</xml_diff>

<commit_message>
Walk back over-engineered note wording; move commute-mode point to meeting agenda
</commit_message>
<xml_diff>
--- a/Accommodation – Medical Documentation/Psychologist/Ken W Letter June 10 2026 PF - KEN EDITS.docx
+++ b/Accommodation – Medical Documentation/Psychologist/Ken W Letter June 10 2026 PF - KEN EDITS.docx
@@ -2212,7 +2212,7 @@
           <w:b w:val="0"/>
           <w:color w:val="1F4E79"/>
         </w:rPr>
-        <w:t>Mr. Wood's condition is triggered and significantly worsened by commuting to and from the workplace, regardless of the mode of travel. On days he commutes:</w:t>
+        <w:t>Mr. Wood's condition is triggered and significantly worsened by commuting to and from the workplace. On days he commutes:</w:t>
       </w:r>
     </w:p>
     <w:p>
@@ -2284,7 +2284,7 @@
           <w:b w:val="0"/>
           <w:color w:val="1F4E79"/>
         </w:rPr>
-        <w:t>Mr. Wood requires a workplace accommodation permitting him to work from home as his functional limitations require, including full-time remote work during periods of elevated symptoms. In-office attendance should be limited to the extent necessary to avoid triggering or worsening these limitations. Alternative commuting arrangements (such as transit or carpooling) would not address these limitations, as the trigger is the commute itself rather than the mode of travel.</w:t>
+        <w:t>Mr. Wood requires a workplace accommodation permitting him to work from home as his functional limitations require, including full-time remote work during periods of elevated symptoms. In-office attendance should be limited to the extent necessary to avoid triggering or worsening these limitations.</w:t>
       </w:r>
     </w:p>
     <w:p>

</xml_diff>

<commit_message>
Add in-office/around-others limitation and unhedge accommodation to foreclose alternatives
</commit_message>
<xml_diff>
--- a/Accommodation – Medical Documentation/Psychologist/Ken W Letter June 10 2026 PF - KEN EDITS.docx
+++ b/Accommodation – Medical Documentation/Psychologist/Ken W Letter June 10 2026 PF - KEN EDITS.docx
@@ -2212,7 +2212,7 @@
           <w:b w:val="0"/>
           <w:color w:val="1F4E79"/>
         </w:rPr>
-        <w:t>Mr. Wood's condition is triggered and significantly worsened by commuting to and from the workplace. On days he commutes:</w:t>
+        <w:t>Mr. Wood's condition is triggered and significantly worsened by in-office attendance, including the commute to and from the workplace. On days he attends the office:</w:t>
       </w:r>
     </w:p>
     <w:p>
@@ -2230,7 +2230,7 @@
           <w:b w:val="0"/>
           <w:color w:val="1F4E79"/>
         </w:rPr>
-        <w:t>– He experiences a heightened stress response that persists after arrival and for one to two days afterward.</w:t>
+        <w:t>– He experiences significant anxiety in the workplace environment around others.</w:t>
       </w:r>
     </w:p>
     <w:p>
@@ -2239,7 +2239,7 @@
           <w:b w:val="0"/>
           <w:color w:val="1F4E79"/>
         </w:rPr>
-        <w:t>– His sleep is disrupted on the nights before in-office attendance.</w:t>
+        <w:t>– He experiences a heightened stress response that persists after arrival and for one to two days afterward.</w:t>
       </w:r>
     </w:p>
     <w:p>
@@ -2248,7 +2248,7 @@
           <w:b w:val="0"/>
           <w:color w:val="1F4E79"/>
         </w:rPr>
-        <w:t>– He experiences fatigue that reduces his concentration, consistency, and his ability to maintain the routines that support his health.</w:t>
+        <w:t>– His sleep is disrupted on the nights before in-office attendance.</w:t>
       </w:r>
     </w:p>
     <w:p>
@@ -2257,7 +2257,7 @@
           <w:b w:val="0"/>
           <w:color w:val="1F4E79"/>
         </w:rPr>
-        <w:t>– These limitations fluctuate; their impact is greater during periods of elevated symptoms.</w:t>
+        <w:t>– He experiences fatigue that reduces his concentration, consistency, and his ability to maintain the routines that support his health.</w:t>
       </w:r>
     </w:p>
     <w:p>
@@ -2266,7 +2266,7 @@
           <w:b w:val="0"/>
           <w:color w:val="1F4E79"/>
         </w:rPr>
-        <w:t>Continued commuting places Mr. Wood at significant risk of serious deterioration of his condition.</w:t>
+        <w:t>– These limitations fluctuate; their impact is greater during periods of elevated symptoms.</w:t>
       </w:r>
     </w:p>
     <w:p>
@@ -2275,7 +2275,7 @@
           <w:b w:val="0"/>
           <w:color w:val="1F4E79"/>
         </w:rPr>
-        <w:t>Accommodation required:</w:t>
+        <w:t>Continued in-office attendance places Mr. Wood at significant risk of serious deterioration of his condition.</w:t>
       </w:r>
     </w:p>
     <w:p>
@@ -2284,7 +2284,25 @@
           <w:b w:val="0"/>
           <w:color w:val="1F4E79"/>
         </w:rPr>
-        <w:t>Mr. Wood requires a workplace accommodation permitting him to work from home as his functional limitations require, including full-time remote work during periods of elevated symptoms. In-office attendance should be limited to the extent necessary to avoid triggering or worsening these limitations.</w:t>
+        <w:t>Accommodation required:</w:t>
+      </w:r>
+    </w:p>
+    <w:p>
+      <w:r>
+        <w:rPr>
+          <w:b w:val="0"/>
+          <w:color w:val="1F4E79"/>
+        </w:rPr>
+        <w:t>Mr. Wood requires a workplace accommodation permitting him to work from home.</w:t>
+      </w:r>
+    </w:p>
+    <w:p>
+      <w:r>
+        <w:rPr>
+          <w:b w:val="0"/>
+          <w:color w:val="1F4E79"/>
+        </w:rPr>
+        <w:t>In-office attendance should be avoided, as it triggers and worsens these limitations.</w:t>
       </w:r>
     </w:p>
     <w:p>

</xml_diff>

<commit_message>
Commit Word-saved report copy (content unchanged)
</commit_message>
<xml_diff>
--- a/Accommodation – Medical Documentation/Psychologist/Ken W Letter June 10 2026 PF - KEN EDITS.docx
+++ b/Accommodation – Medical Documentation/Psychologist/Ken W Letter June 10 2026 PF - KEN EDITS.docx
@@ -459,6 +459,192 @@
         </w:rPr>
         <w:t>th</w:t>
       </w:r>
+      <w:r>
+        <w:rPr>
+          <w:rFonts w:cstheme="minorHAnsi"/>
+          <w:sz w:val="22"/>
+          <w:szCs w:val="22"/>
+        </w:rPr>
+        <w:t xml:space="preserve"> 2026. In addition, I spoke to his Addiction Counsellor at Addiction Services Central Ontario (Paige McKenzie, RSW) and his wife (Becky Wood) on May 15</w:t>
+      </w:r>
+      <w:r>
+        <w:rPr>
+          <w:rFonts w:cstheme="minorHAnsi"/>
+          <w:sz w:val="22"/>
+          <w:szCs w:val="22"/>
+          <w:vertAlign w:val="superscript"/>
+        </w:rPr>
+        <w:t>th</w:t>
+      </w:r>
+      <w:r>
+        <w:rPr>
+          <w:rFonts w:cstheme="minorHAnsi"/>
+          <w:sz w:val="22"/>
+          <w:szCs w:val="22"/>
+        </w:rPr>
+        <w:t xml:space="preserve"> 2026.</w:t>
+      </w:r>
+    </w:p>
+    <w:p>
+      <w:pPr>
+        <w:rPr>
+          <w:rFonts w:cstheme="minorHAnsi"/>
+          <w:sz w:val="22"/>
+          <w:szCs w:val="22"/>
+        </w:rPr>
+      </w:pPr>
+    </w:p>
+    <w:p>
+      <w:pPr>
+        <w:rPr>
+          <w:rFonts w:cstheme="minorHAnsi"/>
+          <w:sz w:val="22"/>
+          <w:szCs w:val="22"/>
+        </w:rPr>
+      </w:pPr>
+      <w:r>
+        <w:rPr>
+          <w:rFonts w:cstheme="minorHAnsi"/>
+          <w:sz w:val="22"/>
+          <w:szCs w:val="22"/>
+        </w:rPr>
+        <w:t xml:space="preserve">Mr. </w:t>
+      </w:r>
+      <w:r>
+        <w:rPr>
+          <w:rFonts w:cstheme="minorHAnsi"/>
+          <w:sz w:val="22"/>
+          <w:szCs w:val="22"/>
+        </w:rPr>
+        <w:t>W</w:t>
+      </w:r>
+      <w:r>
+        <w:rPr>
+          <w:rFonts w:cstheme="minorHAnsi"/>
+          <w:sz w:val="22"/>
+          <w:szCs w:val="22"/>
+        </w:rPr>
+        <w:t xml:space="preserve">ood reported that he has been employed in information technology at the Ministry of Health for 20 years and that he did contract work for the MOH before that. He reported that he is a developer/Team Lead, has been working in the same group for approximately 7 years and that he enjoys what he does at work. </w:t>
+      </w:r>
+      <w:r>
+        <w:rPr>
+          <w:rFonts w:cstheme="minorHAnsi"/>
+          <w:sz w:val="22"/>
+          <w:szCs w:val="22"/>
+        </w:rPr>
+        <w:t>He reported that he has always had good performance reviews and that he has never had any issues with his managers about his productivity.</w:t>
+      </w:r>
+    </w:p>
+    <w:p>
+      <w:pPr>
+        <w:rPr>
+          <w:rFonts w:cstheme="minorHAnsi"/>
+          <w:sz w:val="22"/>
+          <w:szCs w:val="22"/>
+        </w:rPr>
+      </w:pPr>
+    </w:p>
+    <w:p>
+      <w:pPr>
+        <w:rPr>
+          <w:rFonts w:cstheme="minorHAnsi"/>
+          <w:sz w:val="22"/>
+          <w:szCs w:val="22"/>
+        </w:rPr>
+      </w:pPr>
+      <w:r>
+        <w:rPr>
+          <w:rFonts w:cstheme="minorHAnsi"/>
+          <w:sz w:val="22"/>
+          <w:szCs w:val="22"/>
+        </w:rPr>
+        <w:t>He reported that his group started virtual work from home</w:t>
+      </w:r>
+      <w:r>
+        <w:rPr>
+          <w:rFonts w:cstheme="minorHAnsi"/>
+          <w:sz w:val="22"/>
+          <w:szCs w:val="22"/>
+        </w:rPr>
+        <w:t xml:space="preserve"> under an AWA (Alternate Work Agreement) before COVID under which he was working from home two days per week and that he was told to work from home early in 2020. He reported that in the past year he has been going into work once or twice per week but that now there is increasing pressure for him to return to in-office work five days per week.</w:t>
+      </w:r>
+    </w:p>
+    <w:p>
+      <w:pPr>
+        <w:rPr>
+          <w:rFonts w:cstheme="minorHAnsi"/>
+          <w:sz w:val="22"/>
+          <w:szCs w:val="22"/>
+        </w:rPr>
+      </w:pPr>
+    </w:p>
+    <w:p>
+      <w:pPr>
+        <w:rPr>
+          <w:rFonts w:cstheme="minorHAnsi"/>
+          <w:sz w:val="22"/>
+          <w:szCs w:val="22"/>
+        </w:rPr>
+      </w:pPr>
+      <w:r>
+        <w:rPr>
+          <w:rFonts w:cstheme="minorHAnsi"/>
+          <w:sz w:val="22"/>
+          <w:szCs w:val="22"/>
+        </w:rPr>
+        <w:t xml:space="preserve">Mr. Wood is concerned that the stress of daily commuting will cause a relapse of his Alcohol Use Disorder and that is why he is seeking accommodation for working from home. </w:t>
+      </w:r>
+    </w:p>
+    <w:p>
+      <w:pPr>
+        <w:rPr>
+          <w:rFonts w:cstheme="minorHAnsi"/>
+          <w:sz w:val="22"/>
+          <w:szCs w:val="22"/>
+        </w:rPr>
+      </w:pPr>
+    </w:p>
+    <w:p>
+      <w:pPr>
+        <w:rPr>
+          <w:rFonts w:cstheme="minorHAnsi"/>
+          <w:sz w:val="22"/>
+          <w:szCs w:val="22"/>
+        </w:rPr>
+      </w:pPr>
+      <w:r>
+        <w:rPr>
+          <w:rFonts w:cstheme="minorHAnsi"/>
+          <w:sz w:val="22"/>
+          <w:szCs w:val="22"/>
+        </w:rPr>
+        <w:lastRenderedPageBreak/>
+        <w:t xml:space="preserve">r. Wood reported that he started drinking socially at age 15 or 16and that his drinking increased in his 30s and 40s when he started commuting to work. He reported that he ended up being a heavy daily drinker </w:t>
+      </w:r>
+      <w:r>
+        <w:rPr>
+          <w:rFonts w:cstheme="minorHAnsi"/>
+          <w:sz w:val="22"/>
+          <w:szCs w:val="22"/>
+        </w:rPr>
+        <w:t xml:space="preserve">(2-14 drinks per weekday evening) </w:t>
+      </w:r>
+      <w:r>
+        <w:rPr>
+          <w:rFonts w:cstheme="minorHAnsi"/>
+          <w:sz w:val="22"/>
+          <w:szCs w:val="22"/>
+        </w:rPr>
+        <w:t xml:space="preserve">and that he would start to drink when he got home and night to relive the stress of the day and the stress of commuting. He reported that when </w:t>
+      </w:r>
+      <w:r>
+        <w:rPr>
+          <w:rFonts w:cstheme="minorHAnsi"/>
+          <w:sz w:val="22"/>
+          <w:szCs w:val="22"/>
+        </w:rPr>
+        <w:t xml:space="preserve">he was told to work from home at the beginning of </w:t>
+      </w:r>
       <w:proofErr w:type="gramStart"/>
       <w:r>
         <w:rPr>
@@ -466,7 +652,7 @@
           <w:sz w:val="22"/>
           <w:szCs w:val="22"/>
         </w:rPr>
-        <w:t xml:space="preserve"> 2026</w:t>
+        <w:t>COVID</w:t>
       </w:r>
       <w:proofErr w:type="gramEnd"/>
       <w:r>
@@ -475,16 +661,15 @@
           <w:sz w:val="22"/>
           <w:szCs w:val="22"/>
         </w:rPr>
-        <w:t>. In addition, I spoke to his Addiction Counsellor at Addiction Services Central Ontario (Paige McKenzie, RSW) and his wife (Becky Wood) on May 15</w:t>
-      </w:r>
-      <w:r>
-        <w:rPr>
-          <w:rFonts w:cstheme="minorHAnsi"/>
-          <w:sz w:val="22"/>
-          <w:szCs w:val="22"/>
-          <w:vertAlign w:val="superscript"/>
-        </w:rPr>
-        <w:t>th</w:t>
+        <w:t xml:space="preserve"> he realized his drinking was a problem and he quit and he believed that COVID saved his life. He did not seek medical assistance in quitting, or rehab or any 12-step program. He reported that after three weeks he was able to get through the cravings. He reported that he has noticed many positive changes since he stopped drinking.</w:t>
+      </w:r>
+      <w:r>
+        <w:rPr>
+          <w:rFonts w:cstheme="minorHAnsi"/>
+          <w:sz w:val="22"/>
+          <w:szCs w:val="22"/>
+        </w:rPr>
+        <w:t xml:space="preserve"> He reported that prior to COVID he had tried to stop drinking many times but that stopping drinking was really hard and that trying to stop only seemed to make things worse. He reported that in the years when he was drinking </w:t>
       </w:r>
       <w:proofErr w:type="gramStart"/>
       <w:r>
@@ -493,7 +678,7 @@
           <w:sz w:val="22"/>
           <w:szCs w:val="22"/>
         </w:rPr>
-        <w:t xml:space="preserve"> 2026</w:t>
+        <w:t>heavily</w:t>
       </w:r>
       <w:proofErr w:type="gramEnd"/>
       <w:r>
@@ -502,255 +687,6 @@
           <w:sz w:val="22"/>
           <w:szCs w:val="22"/>
         </w:rPr>
-        <w:t>.</w:t>
-      </w:r>
-    </w:p>
-    <w:p>
-      <w:pPr>
-        <w:rPr>
-          <w:rFonts w:cstheme="minorHAnsi"/>
-          <w:sz w:val="22"/>
-          <w:szCs w:val="22"/>
-        </w:rPr>
-      </w:pPr>
-    </w:p>
-    <w:p>
-      <w:pPr>
-        <w:rPr>
-          <w:rFonts w:cstheme="minorHAnsi"/>
-          <w:sz w:val="22"/>
-          <w:szCs w:val="22"/>
-        </w:rPr>
-      </w:pPr>
-      <w:r>
-        <w:rPr>
-          <w:rFonts w:cstheme="minorHAnsi"/>
-          <w:sz w:val="22"/>
-          <w:szCs w:val="22"/>
-        </w:rPr>
-        <w:t xml:space="preserve">Mr. </w:t>
-      </w:r>
-      <w:r>
-        <w:rPr>
-          <w:rFonts w:cstheme="minorHAnsi"/>
-          <w:sz w:val="22"/>
-          <w:szCs w:val="22"/>
-        </w:rPr>
-        <w:t>W</w:t>
-      </w:r>
-      <w:r>
-        <w:rPr>
-          <w:rFonts w:cstheme="minorHAnsi"/>
-          <w:sz w:val="22"/>
-          <w:szCs w:val="22"/>
-        </w:rPr>
-        <w:t xml:space="preserve">ood reported that he has been employed in information technology at the Ministry of Health for 20 years and that he did contract work for the MOH before that. He reported that he is a developer/Team Lead, has been working in the same group for approximately 7 years and that he enjoys what he does at work. </w:t>
-      </w:r>
-      <w:r>
-        <w:rPr>
-          <w:rFonts w:cstheme="minorHAnsi"/>
-          <w:sz w:val="22"/>
-          <w:szCs w:val="22"/>
-        </w:rPr>
-        <w:t>He reported that he has always had good performance reviews and that he has never had any issues with his managers about his productivity.</w:t>
-      </w:r>
-    </w:p>
-    <w:p>
-      <w:pPr>
-        <w:rPr>
-          <w:rFonts w:cstheme="minorHAnsi"/>
-          <w:sz w:val="22"/>
-          <w:szCs w:val="22"/>
-        </w:rPr>
-      </w:pPr>
-    </w:p>
-    <w:p>
-      <w:pPr>
-        <w:rPr>
-          <w:rFonts w:cstheme="minorHAnsi"/>
-          <w:sz w:val="22"/>
-          <w:szCs w:val="22"/>
-        </w:rPr>
-      </w:pPr>
-      <w:r>
-        <w:rPr>
-          <w:rFonts w:cstheme="minorHAnsi"/>
-          <w:sz w:val="22"/>
-          <w:szCs w:val="22"/>
-        </w:rPr>
-        <w:t>He reported that his group started virtual work from home</w:t>
-      </w:r>
-      <w:r>
-        <w:rPr>
-          <w:rFonts w:cstheme="minorHAnsi"/>
-          <w:sz w:val="22"/>
-          <w:szCs w:val="22"/>
-        </w:rPr>
-        <w:t xml:space="preserve"> under an AWA (Alternate Work Agreement) before COVID under which he was working from home two days per week and that he was told to work from home early in 2020. He reported that in the past year he has been going into work once or twice per week but that now there is increasing pressure for him to return to in-office work five days per week.</w:t>
-      </w:r>
-    </w:p>
-    <w:p>
-      <w:pPr>
-        <w:rPr>
-          <w:rFonts w:cstheme="minorHAnsi"/>
-          <w:sz w:val="22"/>
-          <w:szCs w:val="22"/>
-        </w:rPr>
-      </w:pPr>
-    </w:p>
-    <w:p>
-      <w:pPr>
-        <w:rPr>
-          <w:rFonts w:cstheme="minorHAnsi"/>
-          <w:sz w:val="22"/>
-          <w:szCs w:val="22"/>
-        </w:rPr>
-      </w:pPr>
-      <w:r>
-        <w:rPr>
-          <w:rFonts w:cstheme="minorHAnsi"/>
-          <w:sz w:val="22"/>
-          <w:szCs w:val="22"/>
-        </w:rPr>
-        <w:t xml:space="preserve">Mr. Wood is concerned that the stress of daily commuting will cause a relapse of his Alcohol Use Disorder and that is why he is seeking accommodation for working from home. </w:t>
-      </w:r>
-    </w:p>
-    <w:p>
-      <w:pPr>
-        <w:rPr>
-          <w:rFonts w:cstheme="minorHAnsi"/>
-          <w:sz w:val="22"/>
-          <w:szCs w:val="22"/>
-        </w:rPr>
-      </w:pPr>
-    </w:p>
-    <w:p>
-      <w:pPr>
-        <w:rPr>
-          <w:rFonts w:cstheme="minorHAnsi"/>
-          <w:sz w:val="22"/>
-          <w:szCs w:val="22"/>
-        </w:rPr>
-      </w:pPr>
-      <w:r>
-        <w:rPr>
-          <w:rFonts w:cstheme="minorHAnsi"/>
-          <w:sz w:val="22"/>
-          <w:szCs w:val="22"/>
-        </w:rPr>
-        <w:t xml:space="preserve">r. Wood reported that he started drinking socially at age 15 or 16and that his drinking increased in his 30s and 40s when he started commuting to work. He reported that he ended up being a heavy daily </w:t>
-      </w:r>
-      <w:r>
-        <w:rPr>
-          <w:rFonts w:cstheme="minorHAnsi"/>
-          <w:sz w:val="22"/>
-          <w:szCs w:val="22"/>
-        </w:rPr>
-        <w:lastRenderedPageBreak/>
-        <w:t xml:space="preserve">drinker </w:t>
-      </w:r>
-      <w:r>
-        <w:rPr>
-          <w:rFonts w:cstheme="minorHAnsi"/>
-          <w:sz w:val="22"/>
-          <w:szCs w:val="22"/>
-        </w:rPr>
-        <w:t xml:space="preserve">(2-14 drinks per weekday evening) </w:t>
-      </w:r>
-      <w:r>
-        <w:rPr>
-          <w:rFonts w:cstheme="minorHAnsi"/>
-          <w:sz w:val="22"/>
-          <w:szCs w:val="22"/>
-        </w:rPr>
-        <w:t xml:space="preserve">and that he would start to drink when he got home and night to relive the stress of the day and the stress of commuting. He reported that when </w:t>
-      </w:r>
-      <w:r>
-        <w:rPr>
-          <w:rFonts w:cstheme="minorHAnsi"/>
-          <w:sz w:val="22"/>
-          <w:szCs w:val="22"/>
-        </w:rPr>
-        <w:t xml:space="preserve">he was told to work from home at the beginning of </w:t>
-      </w:r>
-      <w:proofErr w:type="gramStart"/>
-      <w:r>
-        <w:rPr>
-          <w:rFonts w:cstheme="minorHAnsi"/>
-          <w:sz w:val="22"/>
-          <w:szCs w:val="22"/>
-        </w:rPr>
-        <w:t>COVID</w:t>
-      </w:r>
-      <w:proofErr w:type="gramEnd"/>
-      <w:r>
-        <w:rPr>
-          <w:rFonts w:cstheme="minorHAnsi"/>
-          <w:sz w:val="22"/>
-          <w:szCs w:val="22"/>
-        </w:rPr>
-        <w:t xml:space="preserve"> he realized his drinking was a problem and he quit and he believed that COVID saved his life. He did not seek medical assistance in quitting, or rehab or any 12-step program. He reported that after three weeks he was able to get through the cravings. He reported that he has noticed many positive changes since he stopped drinking.</w:t>
-      </w:r>
-      <w:r>
-        <w:rPr>
-          <w:rFonts w:cstheme="minorHAnsi"/>
-          <w:sz w:val="22"/>
-          <w:szCs w:val="22"/>
-        </w:rPr>
-        <w:t xml:space="preserve"> He reported that prior to COVID he had tried to stop drinking many </w:t>
-      </w:r>
-      <w:proofErr w:type="gramStart"/>
-      <w:r>
-        <w:rPr>
-          <w:rFonts w:cstheme="minorHAnsi"/>
-          <w:sz w:val="22"/>
-          <w:szCs w:val="22"/>
-        </w:rPr>
-        <w:t>times</w:t>
-      </w:r>
-      <w:proofErr w:type="gramEnd"/>
-      <w:r>
-        <w:rPr>
-          <w:rFonts w:cstheme="minorHAnsi"/>
-          <w:sz w:val="22"/>
-          <w:szCs w:val="22"/>
-        </w:rPr>
-        <w:t xml:space="preserve"> but that stopping drinking was </w:t>
-      </w:r>
-      <w:proofErr w:type="gramStart"/>
-      <w:r>
-        <w:rPr>
-          <w:rFonts w:cstheme="minorHAnsi"/>
-          <w:sz w:val="22"/>
-          <w:szCs w:val="22"/>
-        </w:rPr>
-        <w:t>really hard</w:t>
-      </w:r>
-      <w:proofErr w:type="gramEnd"/>
-      <w:r>
-        <w:rPr>
-          <w:rFonts w:cstheme="minorHAnsi"/>
-          <w:sz w:val="22"/>
-          <w:szCs w:val="22"/>
-        </w:rPr>
-        <w:t xml:space="preserve"> and that trying to stop only seemed to make things worse. He reported that in the years when he was drinking </w:t>
-      </w:r>
-      <w:proofErr w:type="gramStart"/>
-      <w:r>
-        <w:rPr>
-          <w:rFonts w:cstheme="minorHAnsi"/>
-          <w:sz w:val="22"/>
-          <w:szCs w:val="22"/>
-        </w:rPr>
-        <w:t>heavily</w:t>
-      </w:r>
-      <w:proofErr w:type="gramEnd"/>
-      <w:r>
-        <w:rPr>
-          <w:rFonts w:cstheme="minorHAnsi"/>
-          <w:sz w:val="22"/>
-          <w:szCs w:val="22"/>
-        </w:rPr>
         <w:t xml:space="preserve"> he was feeling guilty and sad. He reported that he is terrified of starting drinking again because he is afraid that he won’t be able to stop again.</w:t>
       </w:r>
     </w:p>
@@ -803,25 +739,7 @@
           <w:sz w:val="22"/>
           <w:szCs w:val="22"/>
         </w:rPr>
-        <w:t xml:space="preserve">Ms. Smith reported that Mr. Wood is working with her to try to reduce his stress so that he remains abstinent and that commuting is a major stressor in the past that contributed significantly to his heavy daily drinking. She reported that at present he remains abstinent and only gets cravings after driving. She reported that he has been involved in and witnessed </w:t>
-      </w:r>
-      <w:proofErr w:type="gramStart"/>
-      <w:r>
-        <w:rPr>
-          <w:rFonts w:cstheme="minorHAnsi"/>
-          <w:sz w:val="22"/>
-          <w:szCs w:val="22"/>
-        </w:rPr>
-        <w:t>a number of</w:t>
-      </w:r>
-      <w:proofErr w:type="gramEnd"/>
-      <w:r>
-        <w:rPr>
-          <w:rFonts w:cstheme="minorHAnsi"/>
-          <w:sz w:val="22"/>
-          <w:szCs w:val="22"/>
-        </w:rPr>
-        <w:t xml:space="preserve"> motor vehicle accidents while commuting, including one that involved the death of a child.</w:t>
+        <w:t>Ms. Smith reported that Mr. Wood is working with her to try to reduce his stress so that he remains abstinent and that commuting is a major stressor in the past that contributed significantly to his heavy daily drinking. She reported that at present he remains abstinent and only gets cravings after driving. She reported that he has been involved in and witnessed a number of motor vehicle accidents while commuting, including one that involved the death of a child.</w:t>
       </w:r>
     </w:p>
     <w:p>
@@ -1053,57 +971,160 @@
           <w:sz w:val="22"/>
           <w:szCs w:val="22"/>
         </w:rPr>
-        <w:t xml:space="preserve"> he has a harder time fighting his urges and he is anxious that if he </w:t>
+        <w:t xml:space="preserve"> he has a harder time fighting his urges and he is anxious that if he has to commute to the office 5 days a week he will become stressed out and tired and be unable to fight his urges to drink.</w:t>
+      </w:r>
+    </w:p>
+    <w:p>
+      <w:pPr>
+        <w:rPr>
+          <w:rFonts w:cstheme="minorHAnsi"/>
+          <w:sz w:val="22"/>
+          <w:szCs w:val="22"/>
+        </w:rPr>
+      </w:pPr>
+    </w:p>
+    <w:p>
+      <w:pPr>
+        <w:rPr>
+          <w:rStyle w:val="apple-converted-space"/>
+          <w:rFonts w:cstheme="minorHAnsi"/>
+          <w:color w:val="1B1B1B"/>
+          <w:sz w:val="22"/>
+          <w:szCs w:val="22"/>
+          <w:shd w:val="clear" w:color="auto" w:fill="FFFFFF"/>
+        </w:rPr>
+      </w:pPr>
+      <w:r>
+        <w:rPr>
+          <w:rFonts w:cstheme="minorHAnsi"/>
+          <w:sz w:val="22"/>
+          <w:szCs w:val="22"/>
+        </w:rPr>
+        <w:t>In addition to his significant history of alcohol use disorder Mr. Wood reports a significant history and meets DSM-V</w:t>
+      </w:r>
+      <w:r>
+        <w:rPr>
+          <w:rFonts w:cstheme="minorHAnsi"/>
+          <w:sz w:val="22"/>
+          <w:szCs w:val="22"/>
+        </w:rPr>
+        <w:t>-</w:t>
+      </w:r>
+      <w:r>
+        <w:rPr>
+          <w:rFonts w:cstheme="minorHAnsi"/>
+          <w:sz w:val="22"/>
+          <w:szCs w:val="22"/>
+        </w:rPr>
+        <w:t>TR criteria for Social Anxiety Disorder of moderate severity. He reported that he was a shy and sensitive child and that he has always been extremely anxious about public speaking and being the centre of attention. He scored in the Moderate range of severity on the Liebowitz Social Anxiety Scale.</w:t>
+      </w:r>
+      <w:r>
+        <w:rPr>
+          <w:rFonts w:cstheme="minorHAnsi"/>
+          <w:sz w:val="22"/>
+          <w:szCs w:val="22"/>
+        </w:rPr>
+        <w:t xml:space="preserve"> </w:t>
+      </w:r>
+      <w:r>
+        <w:rPr>
+          <w:rFonts w:cstheme="minorHAnsi"/>
+          <w:color w:val="1B1B1B"/>
+          <w:sz w:val="22"/>
+          <w:szCs w:val="22"/>
+          <w:shd w:val="clear" w:color="auto" w:fill="FFFFFF"/>
+        </w:rPr>
+        <w:t xml:space="preserve">Social anxiety disorder, an excessive fear of social situations, such as eating or speaking in public, affects 2 to 13 percent of the U.S. population. About one-fifth of patients with social anxiety disorder also suffer from an alcohol use disorder (AUD) and the presence of Social Anxiety Disorder puts Mr. Wood at increased risk for Alcohol Use Disorder and </w:t>
+      </w:r>
+      <w:r>
+        <w:rPr>
+          <w:rFonts w:cstheme="minorHAnsi"/>
+          <w:color w:val="1B1B1B"/>
+          <w:sz w:val="22"/>
+          <w:szCs w:val="22"/>
+          <w:shd w:val="clear" w:color="auto" w:fill="FFFFFF"/>
+        </w:rPr>
+        <w:t xml:space="preserve">at increased risk for </w:t>
+      </w:r>
+      <w:r>
+        <w:rPr>
+          <w:rFonts w:cstheme="minorHAnsi"/>
+          <w:color w:val="1B1B1B"/>
+          <w:sz w:val="22"/>
+          <w:szCs w:val="22"/>
+          <w:shd w:val="clear" w:color="auto" w:fill="FFFFFF"/>
+        </w:rPr>
+        <w:t>relapse.</w:t>
+      </w:r>
+      <w:r>
+        <w:rPr>
+          <w:rStyle w:val="apple-converted-space"/>
+          <w:rFonts w:cstheme="minorHAnsi"/>
+          <w:color w:val="1B1B1B"/>
+          <w:sz w:val="22"/>
+          <w:szCs w:val="22"/>
+          <w:shd w:val="clear" w:color="auto" w:fill="FFFFFF"/>
+        </w:rPr>
+        <w:t> </w:t>
+      </w:r>
+    </w:p>
+    <w:p>
+      <w:pPr>
+        <w:rPr>
+          <w:rStyle w:val="apple-converted-space"/>
+          <w:rFonts w:cstheme="minorHAnsi"/>
+          <w:color w:val="1B1B1B"/>
+          <w:sz w:val="22"/>
+          <w:szCs w:val="22"/>
+          <w:shd w:val="clear" w:color="auto" w:fill="FFFFFF"/>
+        </w:rPr>
+      </w:pPr>
+    </w:p>
+    <w:p>
+      <w:pPr>
+        <w:rPr>
+          <w:rFonts w:cstheme="minorHAnsi"/>
+          <w:sz w:val="22"/>
+          <w:szCs w:val="22"/>
+        </w:rPr>
+      </w:pPr>
+      <w:r>
+        <w:rPr>
+          <w:rStyle w:val="apple-converted-space"/>
+          <w:rFonts w:cstheme="minorHAnsi"/>
+          <w:color w:val="1B1B1B"/>
+          <w:sz w:val="22"/>
+          <w:szCs w:val="22"/>
+          <w:shd w:val="clear" w:color="auto" w:fill="FFFFFF"/>
+        </w:rPr>
+        <w:t xml:space="preserve">Mr. Wood reported that he is a very anxious driver and that “driving stresses me out.” He reported a longstanding fear of driving, especially on 400 series highways. He reported that when he gets into the car to go to </w:t>
+      </w:r>
+      <w:r>
+        <w:rPr>
+          <w:rStyle w:val="apple-converted-space"/>
+          <w:rFonts w:cstheme="minorHAnsi"/>
+          <w:color w:val="1B1B1B"/>
+          <w:sz w:val="22"/>
+          <w:szCs w:val="22"/>
+          <w:shd w:val="clear" w:color="auto" w:fill="FFFFFF"/>
+        </w:rPr>
+        <w:t xml:space="preserve">or from </w:t>
       </w:r>
       <w:proofErr w:type="gramStart"/>
       <w:r>
         <w:rPr>
-          <w:rFonts w:cstheme="minorHAnsi"/>
-          <w:sz w:val="22"/>
-          <w:szCs w:val="22"/>
-        </w:rPr>
-        <w:t>has to</w:t>
+          <w:rStyle w:val="apple-converted-space"/>
+          <w:rFonts w:cstheme="minorHAnsi"/>
+          <w:color w:val="1B1B1B"/>
+          <w:sz w:val="22"/>
+          <w:szCs w:val="22"/>
+          <w:shd w:val="clear" w:color="auto" w:fill="FFFFFF"/>
+        </w:rPr>
+        <w:t>work</w:t>
       </w:r>
       <w:proofErr w:type="gramEnd"/>
       <w:r>
         <w:rPr>
-          <w:rFonts w:cstheme="minorHAnsi"/>
-          <w:sz w:val="22"/>
-          <w:szCs w:val="22"/>
-        </w:rPr>
-        <w:t xml:space="preserve"> commute to the office 5 days a </w:t>
-      </w:r>
-      <w:proofErr w:type="gramStart"/>
-      <w:r>
-        <w:rPr>
-          <w:rFonts w:cstheme="minorHAnsi"/>
-          <w:sz w:val="22"/>
-          <w:szCs w:val="22"/>
-        </w:rPr>
-        <w:t>week</w:t>
-      </w:r>
-      <w:proofErr w:type="gramEnd"/>
-      <w:r>
-        <w:rPr>
-          <w:rFonts w:cstheme="minorHAnsi"/>
-          <w:sz w:val="22"/>
-          <w:szCs w:val="22"/>
-        </w:rPr>
-        <w:t xml:space="preserve"> he will become stressed out and tired and be unable to fight his urges to drink.</w:t>
-      </w:r>
-    </w:p>
-    <w:p>
-      <w:pPr>
-        <w:rPr>
-          <w:rFonts w:cstheme="minorHAnsi"/>
-          <w:sz w:val="22"/>
-          <w:szCs w:val="22"/>
-        </w:rPr>
-      </w:pPr>
-    </w:p>
-    <w:p>
-      <w:pPr>
-        <w:rPr>
           <w:rStyle w:val="apple-converted-space"/>
           <w:rFonts w:cstheme="minorHAnsi"/>
           <w:color w:val="1B1B1B"/>
@@ -1111,30 +1132,60 @@
           <w:szCs w:val="22"/>
           <w:shd w:val="clear" w:color="auto" w:fill="FFFFFF"/>
         </w:rPr>
-      </w:pPr>
-      <w:r>
-        <w:rPr>
-          <w:rFonts w:cstheme="minorHAnsi"/>
-          <w:sz w:val="22"/>
-          <w:szCs w:val="22"/>
-        </w:rPr>
-        <w:t>In addition to his significant history of alcohol use disorder Mr. Wood reports a significant history and meets DSM-V</w:t>
-      </w:r>
-      <w:r>
-        <w:rPr>
-          <w:rFonts w:cstheme="minorHAnsi"/>
-          <w:sz w:val="22"/>
-          <w:szCs w:val="22"/>
-        </w:rPr>
-        <w:t>-</w:t>
-      </w:r>
-      <w:r>
-        <w:rPr>
-          <w:rFonts w:cstheme="minorHAnsi"/>
-          <w:sz w:val="22"/>
-          <w:szCs w:val="22"/>
-        </w:rPr>
-        <w:t>TR criteria for Social Anxiety Disorder of moderate severity. He reported that he was a shy and sensitive child and that he has always been extremely anxious about public speaking and being the centre of attention. He scored in the Moderate range of severity on the Liebowitz Social Anxiety Scale.</w:t>
+        <w:t xml:space="preserve"> he has thoughts such as “Is this the day my life is going to change?”, “Am I going to be paralyzed?”, and “Am I going to die?” He reported that he “takes it (driving) seriously”</w:t>
+      </w:r>
+      <w:r>
+        <w:rPr>
+          <w:rFonts w:cstheme="minorHAnsi"/>
+          <w:sz w:val="22"/>
+          <w:szCs w:val="22"/>
+        </w:rPr>
+        <w:t xml:space="preserve"> and that although he isn’t “white knuckled” when he is driving but he is very focused on driving and that he can feel the stress after he gets out of the car after an hour of driving. He reported that because of his anxiety about driving his baseline stress level is already 7/10 by the time he gets to work in the morning and he is “irritable and grumpy” for a day or two after he commutes. He reported that “stress makes me want to drink and driving stresses me out.” He is concerned that he will return to drinking to cope with stress if he has to commute more than a few days a week.</w:t>
+      </w:r>
+    </w:p>
+    <w:p>
+      <w:pPr>
+        <w:rPr>
+          <w:rFonts w:cstheme="minorHAnsi"/>
+          <w:sz w:val="22"/>
+          <w:szCs w:val="22"/>
+        </w:rPr>
+      </w:pPr>
+    </w:p>
+    <w:p>
+      <w:pPr>
+        <w:rPr>
+          <w:rStyle w:val="apple-converted-space"/>
+          <w:rFonts w:cstheme="minorHAnsi"/>
+          <w:color w:val="1B1B1B"/>
+          <w:sz w:val="22"/>
+          <w:szCs w:val="22"/>
+          <w:shd w:val="clear" w:color="auto" w:fill="FFFFFF"/>
+        </w:rPr>
+      </w:pPr>
+      <w:r>
+        <w:rPr>
+          <w:rFonts w:cstheme="minorHAnsi"/>
+          <w:sz w:val="22"/>
+          <w:szCs w:val="22"/>
+        </w:rPr>
+        <w:t>Mr. Wood reported that he has been</w:t>
+      </w:r>
+      <w:r>
+        <w:rPr>
+          <w:rFonts w:cstheme="minorHAnsi"/>
+          <w:sz w:val="22"/>
+          <w:szCs w:val="22"/>
+        </w:rPr>
+        <w:t xml:space="preserve"> involved</w:t>
+      </w:r>
+      <w:r>
+        <w:rPr>
+          <w:rFonts w:cstheme="minorHAnsi"/>
+          <w:sz w:val="22"/>
+          <w:szCs w:val="22"/>
+        </w:rPr>
+        <w:t xml:space="preserve"> in a number of motor vehicle accidents. He reported that he hit a deer once and that he has been rear-ended twice, on one</w:t>
       </w:r>
       <w:r>
         <w:rPr>
@@ -1147,273 +1198,43 @@
       <w:r>
         <w:rPr>
           <w:rFonts w:cstheme="minorHAnsi"/>
+          <w:sz w:val="22"/>
+          <w:szCs w:val="22"/>
+        </w:rPr>
+        <w:t xml:space="preserve">occasion his car was “totalled.” </w:t>
+      </w:r>
+      <w:r>
+        <w:rPr>
+          <w:rFonts w:cstheme="minorHAnsi"/>
+          <w:sz w:val="22"/>
+          <w:szCs w:val="22"/>
+        </w:rPr>
+        <w:t xml:space="preserve">He reported that once while driving to Toronto he saw a woman and child get hit by a car. He described the experience as traumatic. He reported that he has recurring dreams of accidents, </w:t>
+      </w:r>
+      <w:r>
+        <w:rPr>
+          <w:rStyle w:val="apple-converted-space"/>
+          <w:rFonts w:cstheme="minorHAnsi"/>
           <w:color w:val="1B1B1B"/>
           <w:sz w:val="22"/>
           <w:szCs w:val="22"/>
           <w:shd w:val="clear" w:color="auto" w:fill="FFFFFF"/>
         </w:rPr>
-        <w:t xml:space="preserve">Social anxiety disorder, an excessive fear of social situations, such as eating or speaking in public, affects 2 to 13 percent of the U.S. population. About one-fifth of patients with social anxiety disorder also suffer from an alcohol use disorder (AUD) and the presence of Social Anxiety Disorder puts Mr. Wood at increased risk for Alcohol Use Disorder and </w:t>
-      </w:r>
-      <w:r>
-        <w:rPr>
+        <w:t>including a recurring nightmare of him slamming onto the back of a truck. He reported that if he thinks about the accident that killed the woman and child he can “hear the mother’s voice.” If his symptoms do not meet formal DSM-V-TR diagnostic criteria for Posttraumatic In my opinion his fear of driving is best understood as having</w:t>
+      </w:r>
+      <w:r>
+        <w:rPr>
+          <w:rStyle w:val="apple-converted-space"/>
           <w:rFonts w:cstheme="minorHAnsi"/>
           <w:color w:val="1B1B1B"/>
           <w:sz w:val="22"/>
           <w:szCs w:val="22"/>
           <w:shd w:val="clear" w:color="auto" w:fill="FFFFFF"/>
         </w:rPr>
-        <w:t xml:space="preserve">at increased risk for </w:t>
-      </w:r>
-      <w:r>
-        <w:rPr>
-          <w:rFonts w:cstheme="minorHAnsi"/>
-          <w:color w:val="1B1B1B"/>
-          <w:sz w:val="22"/>
-          <w:szCs w:val="22"/>
-          <w:shd w:val="clear" w:color="auto" w:fill="FFFFFF"/>
-        </w:rPr>
-        <w:t>relapse.</w:t>
-      </w:r>
-      <w:r>
-        <w:rPr>
-          <w:rStyle w:val="apple-converted-space"/>
-          <w:rFonts w:cstheme="minorHAnsi"/>
-          <w:color w:val="1B1B1B"/>
-          <w:sz w:val="22"/>
-          <w:szCs w:val="22"/>
-          <w:shd w:val="clear" w:color="auto" w:fill="FFFFFF"/>
-        </w:rPr>
-        <w:t> </w:t>
-      </w:r>
-    </w:p>
-    <w:p>
-      <w:pPr>
-        <w:rPr>
-          <w:rStyle w:val="apple-converted-space"/>
-          <w:rFonts w:cstheme="minorHAnsi"/>
-          <w:color w:val="1B1B1B"/>
-          <w:sz w:val="22"/>
-          <w:szCs w:val="22"/>
-          <w:shd w:val="clear" w:color="auto" w:fill="FFFFFF"/>
-        </w:rPr>
-      </w:pPr>
-    </w:p>
-    <w:p>
-      <w:pPr>
-        <w:rPr>
-          <w:rFonts w:cstheme="minorHAnsi"/>
-          <w:sz w:val="22"/>
-          <w:szCs w:val="22"/>
-        </w:rPr>
-      </w:pPr>
-      <w:r>
-        <w:rPr>
-          <w:rStyle w:val="apple-converted-space"/>
-          <w:rFonts w:cstheme="minorHAnsi"/>
-          <w:color w:val="1B1B1B"/>
-          <w:sz w:val="22"/>
-          <w:szCs w:val="22"/>
-          <w:shd w:val="clear" w:color="auto" w:fill="FFFFFF"/>
-        </w:rPr>
-        <w:lastRenderedPageBreak/>
-        <w:t xml:space="preserve">Mr. Wood reported that he is a very anxious driver and that “driving stresses me out.” He reported a longstanding fear of driving, especially on 400 series highways. He reported that when he gets into the car to go to </w:t>
-      </w:r>
-      <w:r>
-        <w:rPr>
-          <w:rStyle w:val="apple-converted-space"/>
-          <w:rFonts w:cstheme="minorHAnsi"/>
-          <w:color w:val="1B1B1B"/>
-          <w:sz w:val="22"/>
-          <w:szCs w:val="22"/>
-          <w:shd w:val="clear" w:color="auto" w:fill="FFFFFF"/>
-        </w:rPr>
-        <w:t xml:space="preserve">or from </w:t>
-      </w:r>
-      <w:proofErr w:type="gramStart"/>
-      <w:r>
-        <w:rPr>
-          <w:rStyle w:val="apple-converted-space"/>
-          <w:rFonts w:cstheme="minorHAnsi"/>
-          <w:color w:val="1B1B1B"/>
-          <w:sz w:val="22"/>
-          <w:szCs w:val="22"/>
-          <w:shd w:val="clear" w:color="auto" w:fill="FFFFFF"/>
-        </w:rPr>
-        <w:t>work</w:t>
-      </w:r>
-      <w:proofErr w:type="gramEnd"/>
-      <w:r>
-        <w:rPr>
-          <w:rStyle w:val="apple-converted-space"/>
-          <w:rFonts w:cstheme="minorHAnsi"/>
-          <w:color w:val="1B1B1B"/>
-          <w:sz w:val="22"/>
-          <w:szCs w:val="22"/>
-          <w:shd w:val="clear" w:color="auto" w:fill="FFFFFF"/>
-        </w:rPr>
-        <w:t xml:space="preserve"> he has thoughts such as “Is this the day my life is going to change?”, “Am I going to be paralyzed?”, and “Am I going to die?” He reported that he “takes it (driving) seriously”</w:t>
-      </w:r>
-      <w:r>
-        <w:rPr>
-          <w:rFonts w:cstheme="minorHAnsi"/>
-          <w:sz w:val="22"/>
-          <w:szCs w:val="22"/>
-        </w:rPr>
-        <w:t xml:space="preserve"> and that although he isn’t “white knuckled” when he is driving but he is very focused on driving and that he can feel the stress after he gets out of the car after an hour of driving. He reported that because of his anxiety about driving his baseline stress level is already 7/10 by the time he gets to work in the </w:t>
-      </w:r>
-      <w:proofErr w:type="gramStart"/>
-      <w:r>
-        <w:rPr>
-          <w:rFonts w:cstheme="minorHAnsi"/>
-          <w:sz w:val="22"/>
-          <w:szCs w:val="22"/>
-        </w:rPr>
-        <w:t>morning</w:t>
-      </w:r>
-      <w:proofErr w:type="gramEnd"/>
-      <w:r>
-        <w:rPr>
-          <w:rFonts w:cstheme="minorHAnsi"/>
-          <w:sz w:val="22"/>
-          <w:szCs w:val="22"/>
-        </w:rPr>
-        <w:t xml:space="preserve"> and he is “irritable and grumpy” for a day or two after he commutes. He reported that “stress makes me want to drink and driving stresses me out.” He is concerned that he will return to drinking to cope with stress if he </w:t>
-      </w:r>
-      <w:proofErr w:type="gramStart"/>
-      <w:r>
-        <w:rPr>
-          <w:rFonts w:cstheme="minorHAnsi"/>
-          <w:sz w:val="22"/>
-          <w:szCs w:val="22"/>
-        </w:rPr>
-        <w:t>has to</w:t>
-      </w:r>
-      <w:proofErr w:type="gramEnd"/>
-      <w:r>
-        <w:rPr>
-          <w:rFonts w:cstheme="minorHAnsi"/>
-          <w:sz w:val="22"/>
-          <w:szCs w:val="22"/>
-        </w:rPr>
-        <w:t xml:space="preserve"> commute more than a few days a week.</w:t>
-      </w:r>
-    </w:p>
-    <w:p>
-      <w:pPr>
-        <w:rPr>
-          <w:rFonts w:cstheme="minorHAnsi"/>
-          <w:sz w:val="22"/>
-          <w:szCs w:val="22"/>
-        </w:rPr>
-      </w:pPr>
-    </w:p>
-    <w:p>
-      <w:pPr>
-        <w:rPr>
-          <w:rStyle w:val="apple-converted-space"/>
-          <w:rFonts w:cstheme="minorHAnsi"/>
-          <w:color w:val="1B1B1B"/>
-          <w:sz w:val="22"/>
-          <w:szCs w:val="22"/>
-          <w:shd w:val="clear" w:color="auto" w:fill="FFFFFF"/>
-        </w:rPr>
-      </w:pPr>
-      <w:r>
-        <w:rPr>
-          <w:rFonts w:cstheme="minorHAnsi"/>
-          <w:sz w:val="22"/>
-          <w:szCs w:val="22"/>
-        </w:rPr>
-        <w:t>Mr. Wood reported that he has been</w:t>
-      </w:r>
-      <w:r>
-        <w:rPr>
-          <w:rFonts w:cstheme="minorHAnsi"/>
-          <w:sz w:val="22"/>
-          <w:szCs w:val="22"/>
-        </w:rPr>
-        <w:t xml:space="preserve"> involved</w:t>
-      </w:r>
-      <w:r>
-        <w:rPr>
-          <w:rFonts w:cstheme="minorHAnsi"/>
-          <w:sz w:val="22"/>
-          <w:szCs w:val="22"/>
-        </w:rPr>
-        <w:t xml:space="preserve"> in </w:t>
-      </w:r>
-      <w:proofErr w:type="gramStart"/>
-      <w:r>
-        <w:rPr>
-          <w:rFonts w:cstheme="minorHAnsi"/>
-          <w:sz w:val="22"/>
-          <w:szCs w:val="22"/>
-        </w:rPr>
-        <w:t>a number of</w:t>
-      </w:r>
-      <w:proofErr w:type="gramEnd"/>
-      <w:r>
-        <w:rPr>
-          <w:rFonts w:cstheme="minorHAnsi"/>
-          <w:sz w:val="22"/>
-          <w:szCs w:val="22"/>
-        </w:rPr>
-        <w:t xml:space="preserve"> motor vehicle accidents. He reported that he hit a deer once and that he has been rear-ended twice, on one</w:t>
-      </w:r>
-      <w:r>
-        <w:rPr>
-          <w:rFonts w:cstheme="minorHAnsi"/>
-          <w:sz w:val="22"/>
-          <w:szCs w:val="22"/>
-        </w:rPr>
-        <w:t xml:space="preserve"> </w:t>
-      </w:r>
-      <w:r>
-        <w:rPr>
-          <w:rFonts w:cstheme="minorHAnsi"/>
-          <w:sz w:val="22"/>
-          <w:szCs w:val="22"/>
-        </w:rPr>
-        <w:t xml:space="preserve">occasion his car was “totalled.” </w:t>
-      </w:r>
-      <w:r>
-        <w:rPr>
-          <w:rFonts w:cstheme="minorHAnsi"/>
-          <w:sz w:val="22"/>
-          <w:szCs w:val="22"/>
-        </w:rPr>
-        <w:t xml:space="preserve">He reported that once while driving to Toronto he saw a woman and child get hit by a car. He described the experience as traumatic. He reported that he has recurring dreams of accidents, </w:t>
-      </w:r>
-      <w:r>
-        <w:rPr>
-          <w:rStyle w:val="apple-converted-space"/>
-          <w:rFonts w:cstheme="minorHAnsi"/>
-          <w:color w:val="1B1B1B"/>
-          <w:sz w:val="22"/>
-          <w:szCs w:val="22"/>
-          <w:shd w:val="clear" w:color="auto" w:fill="FFFFFF"/>
-        </w:rPr>
-        <w:t>including a recurring nightmare of him slamming onto the back of a truck. He reported that if he thinks about the accident that killed the woman and child he can “hear the mother’s voice.” If his symptoms do not meet formal DSM-V-TR diagnostic criteria for Posttraumatic In my opinion his fear of driving is best understood as having</w:t>
-      </w:r>
-      <w:r>
-        <w:rPr>
-          <w:rStyle w:val="apple-converted-space"/>
-          <w:rFonts w:cstheme="minorHAnsi"/>
-          <w:color w:val="1B1B1B"/>
-          <w:sz w:val="22"/>
-          <w:szCs w:val="22"/>
-          <w:shd w:val="clear" w:color="auto" w:fill="FFFFFF"/>
-        </w:rPr>
         <w:t xml:space="preserve"> a strong traumatic component.</w:t>
       </w:r>
     </w:p>
-    <w:p>
-      <w:r>
-        <w:rPr>
-          <w:b w:val="0"/>
-        </w:rPr>
-      </w:r>
-    </w:p>
+    <w:p/>
     <w:p>
       <w:r>
         <w:rPr>
@@ -1426,7 +1247,6 @@
     <w:p>
       <w:r>
         <w:rPr>
-          <w:b w:val="0"/>
           <w:color w:val="1F4E79"/>
         </w:rPr>
         <w:t>Routines and structure: Commuting disrupts my morning routine (exercise, grounding, a planned start to the day), leaves me unable to decompress after work, and makes it hard to keep up the routines that support my recovery — regular exercise, consistent meals, and grounding.</w:t>
@@ -1435,7 +1255,6 @@
     <w:p>
       <w:r>
         <w:rPr>
-          <w:b w:val="0"/>
           <w:color w:val="1F4E79"/>
         </w:rPr>
         <w:t>Access to treatment and supports: Commuting cuts into my ability to attend counselling and medical appointments and makes me less flexible about engaging in treatment. Working from home keeps me able to do those things.</w:t>
@@ -1444,7 +1263,6 @@
     <w:p>
       <w:r>
         <w:rPr>
-          <w:b w:val="0"/>
           <w:color w:val="1F4E79"/>
         </w:rPr>
         <w:t>Cognitive functioning: After a commute I have trouble sustaining focus, and when I am tired I find planning, organizing, and decision-making harder.</w:t>
@@ -1453,7 +1271,6 @@
     <w:p>
       <w:r>
         <w:rPr>
-          <w:b w:val="0"/>
           <w:color w:val="1F4E79"/>
         </w:rPr>
         <w:t>Triggers and environmental factors: The commute and the return-home routine expose me to triggers tied to my past drinking, and the unpredictability of traffic and weather throws off the routine that keeps me stable.</w:t>
@@ -1462,7 +1279,6 @@
     <w:p>
       <w:r>
         <w:rPr>
-          <w:b w:val="0"/>
           <w:color w:val="1F4E79"/>
         </w:rPr>
         <w:t>These limitations fluctuate; the impact is worse during periods of elevated symptoms.</w:t>
@@ -1471,7 +1287,6 @@
     <w:p>
       <w:r>
         <w:rPr>
-          <w:b w:val="0"/>
           <w:color w:val="1F4E79"/>
         </w:rPr>
         <w:t>On days I work from home I do not get intrusive thoughts, urges, or the post-commute fatigue. My sleep and functioning are stable. The only thing that changes between those two states is the commute.</w:t>
@@ -1623,6 +1438,7 @@
           <w:sz w:val="22"/>
           <w:szCs w:val="22"/>
         </w:rPr>
+        <w:lastRenderedPageBreak/>
         <w:t>Recommendations</w:t>
       </w:r>
     </w:p>
@@ -1812,13 +1628,7 @@
         <w:t xml:space="preserve"> because I think that the risk of him relapsing to alcohol in response to stress is currently very significant and will not diminish for a long time, if ever.</w:t>
       </w:r>
     </w:p>
-    <w:p>
-      <w:r>
-        <w:rPr>
-          <w:b w:val="0"/>
-        </w:rPr>
-      </w:r>
-    </w:p>
+    <w:p/>
     <w:p>
       <w:r>
         <w:rPr>
@@ -1831,7 +1641,6 @@
     <w:p>
       <w:r>
         <w:rPr>
-          <w:b w:val="0"/>
           <w:color w:val="1F4E79"/>
         </w:rPr>
         <w:t>I am asking for remote work, not a fixed limit of two or three days a week in the office. Suggested wording:</w:t>
@@ -1840,7 +1649,6 @@
     <w:p>
       <w:r>
         <w:rPr>
-          <w:b w:val="0"/>
           <w:color w:val="1F4E79"/>
         </w:rPr>
         <w:t>“Ken requires an accommodation that permits him to work from home as his functional limitations require, including full-time remote work during periods of elevated symptoms, with in-office attendance limited to what is necessary to avoid triggering or worsening his limitations.”</w:t>
@@ -2001,34 +1809,10 @@
           <w:sz w:val="22"/>
           <w:szCs w:val="22"/>
         </w:rPr>
-        <w:t xml:space="preserve"> In summary, Mr. Wood may be able to benefit from intensive </w:t>
-      </w:r>
-      <w:proofErr w:type="gramStart"/>
-      <w:r>
-        <w:rPr>
-          <w:rFonts w:cstheme="minorHAnsi"/>
-          <w:sz w:val="22"/>
-          <w:szCs w:val="22"/>
-        </w:rPr>
-        <w:t>treatment</w:t>
-      </w:r>
-      <w:proofErr w:type="gramEnd"/>
-      <w:r>
-        <w:rPr>
-          <w:rFonts w:cstheme="minorHAnsi"/>
-          <w:sz w:val="22"/>
-          <w:szCs w:val="22"/>
-        </w:rPr>
-        <w:t xml:space="preserve"> but I am not sure that Mr. Woods extended health benefits would cover that much treatment.</w:t>
-      </w:r>
-    </w:p>
-    <w:p>
-      <w:r>
-        <w:rPr>
-          <w:b w:val="0"/>
-        </w:rPr>
-      </w:r>
-    </w:p>
+        <w:t xml:space="preserve"> In summary, Mr. Wood may be able to benefit from intensive treatment but I am not sure that Mr. Woods extended health benefits would cover that much treatment.</w:t>
+      </w:r>
+    </w:p>
+    <w:p/>
     <w:p>
       <w:r>
         <w:rPr>
@@ -2041,7 +1825,6 @@
     <w:p>
       <w:r>
         <w:rPr>
-          <w:b w:val="0"/>
           <w:color w:val="1F4E79"/>
         </w:rPr>
         <w:t>I understand the plan is CBT, possibly with medication. It would help if the report noted the review timeline, roughly a year.</w:t>
@@ -2136,13 +1919,7 @@
         <w:t>…</w:t>
       </w:r>
     </w:p>
-    <w:p>
-      <w:r>
-        <w:rPr>
-          <w:b w:val="0"/>
-        </w:rPr>
-      </w:r>
-    </w:p>
+    <w:p/>
     <w:p>
       <w:r>
         <w:rPr>
@@ -2155,7 +1932,6 @@
     <w:p>
       <w:r>
         <w:rPr>
-          <w:b w:val="0"/>
           <w:color w:val="1F4E79"/>
         </w:rPr>
         <w:t>[CLINIC LETTERHEAD]</w:t>
@@ -2164,7 +1940,6 @@
     <w:p>
       <w:r>
         <w:rPr>
-          <w:b w:val="0"/>
           <w:color w:val="1F4E79"/>
         </w:rPr>
         <w:t>Date: ____________________</w:t>
@@ -2173,115 +1948,180 @@
     <w:p>
       <w:r>
         <w:rPr>
-          <w:b w:val="0"/>
           <w:color w:val="1F4E79"/>
         </w:rPr>
         <w:t>To Whom It May Concern (Attention: Human Resources):</w:t>
       </w:r>
     </w:p>
     <w:p>
-      <w:r>
-        <w:rPr>
-          <w:b w:val="0"/>
+      <w:pPr>
+        <w:rPr>
+          <w:color w:val="1F4E79"/>
+        </w:rPr>
+      </w:pPr>
+      <w:r>
+        <w:rPr>
           <w:color w:val="1F4E79"/>
         </w:rPr>
         <w:t>Re: Ken Wood — DOB: ____________________</w:t>
       </w:r>
     </w:p>
     <w:p>
-      <w:r>
-        <w:rPr>
-          <w:b w:val="0"/>
+      <w:pPr>
+        <w:rPr>
+          <w:color w:val="1F4E79"/>
+        </w:rPr>
+      </w:pPr>
+    </w:p>
+    <w:p/>
+    <w:p>
+      <w:r>
+        <w:rPr>
           <w:color w:val="1F4E79"/>
         </w:rPr>
         <w:t>I am the treating physician for Mr. Ken Wood, and he is a patient in my care.</w:t>
       </w:r>
     </w:p>
     <w:p>
-      <w:r>
-        <w:rPr>
-          <w:b w:val="0"/>
+      <w:pPr>
+        <w:rPr>
+          <w:color w:val="1F4E79"/>
+        </w:rPr>
+      </w:pPr>
+    </w:p>
+    <w:p>
+      <w:r>
+        <w:rPr>
           <w:color w:val="1F4E79"/>
         </w:rPr>
         <w:t>Mr. Wood has a diagnosed medical condition that constitutes a disability within the meaning of the Ontario Human Rights Code.</w:t>
       </w:r>
     </w:p>
     <w:p>
-      <w:r>
-        <w:rPr>
-          <w:b w:val="0"/>
-          <w:color w:val="1F4E79"/>
-        </w:rPr>
-        <w:t>Mr. Wood's condition is triggered and significantly worsened by in-office attendance, including the commute to and from the workplace. On days he attends the office:</w:t>
-      </w:r>
-    </w:p>
-    <w:p>
-      <w:r>
-        <w:rPr>
-          <w:b w:val="0"/>
+      <w:pPr>
+        <w:rPr>
+          <w:color w:val="1F4E79"/>
+        </w:rPr>
+      </w:pPr>
+    </w:p>
+    <w:p>
+      <w:pPr>
+        <w:rPr>
+          <w:color w:val="1F4E79"/>
+        </w:rPr>
+      </w:pPr>
+      <w:r>
+        <w:rPr>
+          <w:color w:val="1F4E79"/>
+        </w:rPr>
+        <w:t xml:space="preserve">Mr. Wood's condition is triggered and significantly worsened by in-office attendance, including the commute to and from the workplace. </w:t>
+      </w:r>
+    </w:p>
+    <w:p>
+      <w:pPr>
+        <w:rPr>
+          <w:color w:val="1F4E79"/>
+        </w:rPr>
+      </w:pPr>
+    </w:p>
+    <w:p>
+      <w:r>
+        <w:rPr>
+          <w:color w:val="1F4E79"/>
+        </w:rPr>
+        <w:t>On days he attends the office:</w:t>
+      </w:r>
+    </w:p>
+    <w:p>
+      <w:pPr>
+        <w:ind w:left="720"/>
+      </w:pPr>
+      <w:r>
+        <w:rPr>
           <w:color w:val="1F4E79"/>
         </w:rPr>
         <w:t>– He experiences significant anxiety about the commute itself.</w:t>
       </w:r>
     </w:p>
     <w:p>
-      <w:r>
-        <w:rPr>
-          <w:b w:val="0"/>
+      <w:pPr>
+        <w:ind w:left="720"/>
+      </w:pPr>
+      <w:r>
+        <w:rPr>
           <w:color w:val="1F4E79"/>
         </w:rPr>
         <w:t>– He experiences significant anxiety in the workplace environment around others.</w:t>
       </w:r>
     </w:p>
     <w:p>
-      <w:r>
-        <w:rPr>
-          <w:b w:val="0"/>
+      <w:pPr>
+        <w:ind w:left="720"/>
+      </w:pPr>
+      <w:r>
+        <w:rPr>
           <w:color w:val="1F4E79"/>
         </w:rPr>
         <w:t>– He experiences a heightened stress response that persists after arrival and for one to two days afterward.</w:t>
       </w:r>
     </w:p>
     <w:p>
-      <w:r>
-        <w:rPr>
-          <w:b w:val="0"/>
+      <w:pPr>
+        <w:ind w:left="720"/>
+      </w:pPr>
+      <w:r>
+        <w:rPr>
           <w:color w:val="1F4E79"/>
         </w:rPr>
         <w:t>– His sleep is disrupted on the nights before in-office attendance.</w:t>
       </w:r>
     </w:p>
     <w:p>
-      <w:r>
-        <w:rPr>
-          <w:b w:val="0"/>
+      <w:pPr>
+        <w:ind w:left="720"/>
+      </w:pPr>
+      <w:r>
+        <w:rPr>
           <w:color w:val="1F4E79"/>
         </w:rPr>
         <w:t>– He experiences fatigue that reduces his concentration, consistency, and his ability to maintain the routines that support his health.</w:t>
       </w:r>
     </w:p>
     <w:p>
-      <w:r>
-        <w:rPr>
-          <w:b w:val="0"/>
+      <w:pPr>
+        <w:ind w:left="720"/>
+      </w:pPr>
+      <w:r>
+        <w:rPr>
           <w:color w:val="1F4E79"/>
         </w:rPr>
         <w:t>– These limitations fluctuate; their impact is greater during periods of elevated symptoms.</w:t>
       </w:r>
     </w:p>
     <w:p>
-      <w:r>
-        <w:rPr>
-          <w:b w:val="0"/>
+      <w:pPr>
+        <w:rPr>
+          <w:color w:val="1F4E79"/>
+        </w:rPr>
+      </w:pPr>
+    </w:p>
+    <w:p>
+      <w:pPr>
+        <w:rPr>
+          <w:color w:val="1F4E79"/>
+        </w:rPr>
+      </w:pPr>
+      <w:r>
+        <w:rPr>
           <w:color w:val="1F4E79"/>
         </w:rPr>
         <w:t>Continued in-office attendance places Mr. Wood at significant risk of serious deterioration of his condition.</w:t>
       </w:r>
     </w:p>
-    <w:p>
-      <w:r>
-        <w:rPr>
-          <w:b w:val="0"/>
+    <w:p/>
+    <w:p>
+      <w:r>
+        <w:rPr>
           <w:color w:val="1F4E79"/>
         </w:rPr>
         <w:t>Accommodation required:</w:t>
@@ -2290,7 +2130,6 @@
     <w:p>
       <w:r>
         <w:rPr>
-          <w:b w:val="0"/>
           <w:color w:val="1F4E79"/>
         </w:rPr>
         <w:t>Mr. Wood requires a workplace accommodation permitting him to work from home.</w:t>
@@ -2299,25 +2138,43 @@
     <w:p>
       <w:r>
         <w:rPr>
-          <w:b w:val="0"/>
           <w:color w:val="1F4E79"/>
         </w:rPr>
         <w:t>In-office attendance should be avoided, as it triggers and worsens these limitations.</w:t>
       </w:r>
     </w:p>
     <w:p>
-      <w:r>
-        <w:rPr>
-          <w:b w:val="0"/>
+      <w:pPr>
+        <w:rPr>
+          <w:color w:val="1F4E79"/>
+        </w:rPr>
+      </w:pPr>
+    </w:p>
+    <w:p>
+      <w:r>
+        <w:rPr>
           <w:color w:val="1F4E79"/>
         </w:rPr>
         <w:t>Duration: Ongoing condition.</w:t>
       </w:r>
     </w:p>
     <w:p>
-      <w:r>
-        <w:rPr>
-          <w:b w:val="0"/>
+      <w:pPr>
+        <w:rPr>
+          <w:color w:val="1F4E79"/>
+        </w:rPr>
+      </w:pPr>
+    </w:p>
+    <w:p>
+      <w:pPr>
+        <w:rPr>
+          <w:color w:val="1F4E79"/>
+        </w:rPr>
+      </w:pPr>
+    </w:p>
+    <w:p>
+      <w:r>
+        <w:rPr>
           <w:color w:val="1F4E79"/>
         </w:rPr>
         <w:t>Signed: ______________________________   Date: ______________</w:t>
@@ -2326,7 +2183,6 @@
     <w:p>
       <w:r>
         <w:rPr>
-          <w:b w:val="0"/>
           <w:color w:val="1F4E79"/>
         </w:rPr>
         <w:t>[Physician name, credentials, CPSO #]</w:t>

</xml_diff>